<commit_message>
Rebuild final docs, add build scripts to scripts/
</commit_message>
<xml_diff>
--- a/final_docs/Omakase_Top15.docx
+++ b/final_docs/Omakase_Top15.docx
@@ -5,6 +5,7 @@
     <w:p>
       <w:pPr>
         <w:spacing w:after="200"/>
+        <w:jc w:val="center"/>
       </w:pPr>
       <w:r>
         <w:rPr>
@@ -20,7 +21,7 @@
     <w:p>
       <w:pPr>
         <w:tabs>
-          <w:tab w:val="center" w:pos="5100"/>
+          <w:tab w:val="center" w:pos="5040"/>
         </w:tabs>
         <w:spacing w:after="30" w:before="0"/>
       </w:pPr>
@@ -64,7 +65,7 @@
     </w:p>
     <w:tbl>
       <w:tblPr>
-        <w:tblW w:type="dxa" w:w="9360"/>
+        <w:tblW w:type="dxa" w:w="10080"/>
         <w:tblBorders>
           <w:top w:val="single" w:color="auto" w:sz="4"/>
           <w:left w:val="single" w:color="auto" w:sz="4"/>
@@ -75,15 +76,16 @@
         </w:tblBorders>
       </w:tblPr>
       <w:tblGrid>
-        <w:gridCol w:w="2340"/>
-        <w:gridCol w:w="2340"/>
-        <w:gridCol w:w="2340"/>
-        <w:gridCol w:w="2340"/>
+        <w:gridCol w:w="1800"/>
+        <w:gridCol w:w="1600"/>
+        <w:gridCol w:w="1700"/>
+        <w:gridCol w:w="1700"/>
+        <w:gridCol w:w="3280"/>
       </w:tblGrid>
       <w:tr>
         <w:tc>
           <w:tcPr>
-            <w:tcW w:type="dxa" w:w="2340"/>
+            <w:tcW w:type="dxa" w:w="1800"/>
             <w:tcBorders>
               <w:top w:val="none" w:color="FFFFFF" w:sz="0"/>
               <w:left w:val="none" w:color="FFFFFF" w:sz="0"/>
@@ -93,18 +95,22 @@
             <w:shd w:fill="E6F1FB" w:val="clear"/>
             <w:tcMar>
               <w:top w:type="dxa" w:w="40"/>
-              <w:left w:type="dxa" w:w="80"/>
-              <w:bottom w:type="dxa" w:w="40"/>
-              <w:right w:type="dxa" w:w="80"/>
-            </w:tcMar>
-          </w:tcPr>
-          <w:p>
-            <w:r>
-              <w:rPr>
-                <w:rFonts w:ascii="Arial" w:cs="Arial" w:eastAsia="Arial" w:hAnsi="Arial"/>
-                <w:color w:val="555555"/>
-                <w:sz w:val="17"/>
-                <w:szCs w:val="17"/>
+              <w:left w:type="dxa" w:w="60"/>
+              <w:bottom w:type="dxa" w:w="40"/>
+              <w:right w:type="dxa" w:w="60"/>
+            </w:tcMar>
+            <w:vAlign w:val="center"/>
+          </w:tcPr>
+          <w:p>
+            <w:pPr>
+              <w:jc w:val="center"/>
+            </w:pPr>
+            <w:r>
+              <w:rPr>
+                <w:rFonts w:ascii="Arial" w:cs="Arial" w:eastAsia="Arial" w:hAnsi="Arial"/>
+                <w:color w:val="555555"/>
+                <w:sz w:val="15"/>
+                <w:szCs w:val="15"/>
               </w:rPr>
               <w:t xml:space="preserve">Price: </w:t>
             </w:r>
@@ -113,8 +119,8 @@
                 <w:rFonts w:ascii="Arial" w:cs="Arial" w:eastAsia="Arial" w:hAnsi="Arial"/>
                 <w:b/>
                 <w:bCs/>
-                <w:sz w:val="17"/>
-                <w:szCs w:val="17"/>
+                <w:sz w:val="15"/>
+                <w:szCs w:val="15"/>
               </w:rPr>
               <w:t xml:space="preserve">$109</w:t>
             </w:r>
@@ -122,7 +128,7 @@
         </w:tc>
         <w:tc>
           <w:tcPr>
-            <w:tcW w:type="dxa" w:w="2340"/>
+            <w:tcW w:type="dxa" w:w="1600"/>
             <w:tcBorders>
               <w:top w:val="none" w:color="FFFFFF" w:sz="0"/>
               <w:left w:val="none" w:color="FFFFFF" w:sz="0"/>
@@ -132,18 +138,22 @@
             <w:shd w:fill="E6F1FB" w:val="clear"/>
             <w:tcMar>
               <w:top w:type="dxa" w:w="40"/>
-              <w:left w:type="dxa" w:w="80"/>
-              <w:bottom w:type="dxa" w:w="40"/>
-              <w:right w:type="dxa" w:w="80"/>
-            </w:tcMar>
-          </w:tcPr>
-          <w:p>
-            <w:r>
-              <w:rPr>
-                <w:rFonts w:ascii="Arial" w:cs="Arial" w:eastAsia="Arial" w:hAnsi="Arial"/>
-                <w:color w:val="555555"/>
-                <w:sz w:val="17"/>
-                <w:szCs w:val="17"/>
+              <w:left w:type="dxa" w:w="60"/>
+              <w:bottom w:type="dxa" w:w="40"/>
+              <w:right w:type="dxa" w:w="60"/>
+            </w:tcMar>
+            <w:vAlign w:val="center"/>
+          </w:tcPr>
+          <w:p>
+            <w:pPr>
+              <w:jc w:val="center"/>
+            </w:pPr>
+            <w:r>
+              <w:rPr>
+                <w:rFonts w:ascii="Arial" w:cs="Arial" w:eastAsia="Arial" w:hAnsi="Arial"/>
+                <w:color w:val="555555"/>
+                <w:sz w:val="15"/>
+                <w:szCs w:val="15"/>
               </w:rPr>
               <w:t xml:space="preserve">Courses: </w:t>
             </w:r>
@@ -152,8 +162,8 @@
                 <w:rFonts w:ascii="Arial" w:cs="Arial" w:eastAsia="Arial" w:hAnsi="Arial"/>
                 <w:b/>
                 <w:bCs/>
-                <w:sz w:val="17"/>
-                <w:szCs w:val="17"/>
+                <w:sz w:val="15"/>
+                <w:szCs w:val="15"/>
               </w:rPr>
               <w:t xml:space="preserve">14</w:t>
             </w:r>
@@ -161,7 +171,7 @@
         </w:tc>
         <w:tc>
           <w:tcPr>
-            <w:tcW w:type="dxa" w:w="2340"/>
+            <w:tcW w:type="dxa" w:w="1700"/>
             <w:tcBorders>
               <w:top w:val="none" w:color="FFFFFF" w:sz="0"/>
               <w:left w:val="none" w:color="FFFFFF" w:sz="0"/>
@@ -171,18 +181,22 @@
             <w:shd w:fill="E8F5E9" w:val="clear"/>
             <w:tcMar>
               <w:top w:type="dxa" w:w="40"/>
-              <w:left w:type="dxa" w:w="80"/>
-              <w:bottom w:type="dxa" w:w="40"/>
-              <w:right w:type="dxa" w:w="80"/>
-            </w:tcMar>
-          </w:tcPr>
-          <w:p>
-            <w:r>
-              <w:rPr>
-                <w:rFonts w:ascii="Arial" w:cs="Arial" w:eastAsia="Arial" w:hAnsi="Arial"/>
-                <w:color w:val="555555"/>
-                <w:sz w:val="17"/>
-                <w:szCs w:val="17"/>
+              <w:left w:type="dxa" w:w="60"/>
+              <w:bottom w:type="dxa" w:w="40"/>
+              <w:right w:type="dxa" w:w="60"/>
+            </w:tcMar>
+            <w:vAlign w:val="center"/>
+          </w:tcPr>
+          <w:p>
+            <w:pPr>
+              <w:jc w:val="center"/>
+            </w:pPr>
+            <w:r>
+              <w:rPr>
+                <w:rFonts w:ascii="Arial" w:cs="Arial" w:eastAsia="Arial" w:hAnsi="Arial"/>
+                <w:color w:val="555555"/>
+                <w:sz w:val="15"/>
+                <w:szCs w:val="15"/>
               </w:rPr>
               <w:t xml:space="preserve">Session: </w:t>
             </w:r>
@@ -191,8 +205,8 @@
                 <w:rFonts w:ascii="Arial" w:cs="Arial" w:eastAsia="Arial" w:hAnsi="Arial"/>
                 <w:b/>
                 <w:bCs/>
-                <w:sz w:val="17"/>
-                <w:szCs w:val="17"/>
+                <w:sz w:val="15"/>
+                <w:szCs w:val="15"/>
               </w:rPr>
               <w:t xml:space="preserve">60-75 min</w:t>
             </w:r>
@@ -200,7 +214,7 @@
         </w:tc>
         <w:tc>
           <w:tcPr>
-            <w:tcW w:type="dxa" w:w="2340"/>
+            <w:tcW w:type="dxa" w:w="1700"/>
             <w:tcBorders>
               <w:top w:val="none" w:color="FFFFFF" w:sz="0"/>
               <w:left w:val="none" w:color="FFFFFF" w:sz="0"/>
@@ -210,18 +224,22 @@
             <w:shd w:fill="F1EFE8" w:val="clear"/>
             <w:tcMar>
               <w:top w:type="dxa" w:w="40"/>
-              <w:left w:type="dxa" w:w="80"/>
-              <w:bottom w:type="dxa" w:w="40"/>
-              <w:right w:type="dxa" w:w="80"/>
-            </w:tcMar>
-          </w:tcPr>
-          <w:p>
-            <w:r>
-              <w:rPr>
-                <w:rFonts w:ascii="Arial" w:cs="Arial" w:eastAsia="Arial" w:hAnsi="Arial"/>
-                <w:color w:val="555555"/>
-                <w:sz w:val="17"/>
-                <w:szCs w:val="17"/>
+              <w:left w:type="dxa" w:w="60"/>
+              <w:bottom w:type="dxa" w:w="40"/>
+              <w:right w:type="dxa" w:w="60"/>
+            </w:tcMar>
+            <w:vAlign w:val="center"/>
+          </w:tcPr>
+          <w:p>
+            <w:pPr>
+              <w:jc w:val="center"/>
+            </w:pPr>
+            <w:r>
+              <w:rPr>
+                <w:rFonts w:ascii="Arial" w:cs="Arial" w:eastAsia="Arial" w:hAnsi="Arial"/>
+                <w:color w:val="555555"/>
+                <w:sz w:val="15"/>
+                <w:szCs w:val="15"/>
               </w:rPr>
               <w:t xml:space="preserve">BYOB: </w:t>
             </w:r>
@@ -230,10 +248,53 @@
                 <w:rFonts w:ascii="Arial" w:cs="Arial" w:eastAsia="Arial" w:hAnsi="Arial"/>
                 <w:b w:val="false"/>
                 <w:bCs w:val="false"/>
-                <w:sz w:val="17"/>
-                <w:szCs w:val="17"/>
+                <w:sz w:val="15"/>
+                <w:szCs w:val="15"/>
               </w:rPr>
               <w:t xml:space="preserve">No</w:t>
+            </w:r>
+          </w:p>
+        </w:tc>
+        <w:tc>
+          <w:tcPr>
+            <w:tcW w:type="dxa" w:w="3280"/>
+            <w:tcBorders>
+              <w:top w:val="none" w:color="FFFFFF" w:sz="0"/>
+              <w:left w:val="none" w:color="FFFFFF" w:sz="0"/>
+              <w:bottom w:val="none" w:color="FFFFFF" w:sz="0"/>
+              <w:right w:val="none" w:color="FFFFFF" w:sz="0"/>
+            </w:tcBorders>
+            <w:shd w:fill="F0F0F0" w:val="clear"/>
+            <w:tcMar>
+              <w:top w:type="dxa" w:w="40"/>
+              <w:left w:type="dxa" w:w="60"/>
+              <w:bottom w:type="dxa" w:w="40"/>
+              <w:right w:type="dxa" w:w="60"/>
+            </w:tcMar>
+            <w:vAlign w:val="center"/>
+          </w:tcPr>
+          <w:p>
+            <w:pPr>
+              <w:jc w:val="center"/>
+            </w:pPr>
+            <w:r>
+              <w:rPr>
+                <w:rFonts w:ascii="Arial" w:cs="Arial" w:eastAsia="Arial" w:hAnsi="Arial"/>
+                <w:color w:val="555555"/>
+                <w:sz w:val="15"/>
+                <w:szCs w:val="15"/>
+              </w:rPr>
+              <w:t xml:space="preserve">G / Y: </w:t>
+            </w:r>
+            <w:r>
+              <w:rPr>
+                <w:rFonts w:ascii="Arial" w:cs="Arial" w:eastAsia="Arial" w:hAnsi="Arial"/>
+                <w:b/>
+                <w:bCs/>
+                <w:sz w:val="15"/>
+                <w:szCs w:val="15"/>
+              </w:rPr>
+              <w:t xml:space="preserve">4.9 (231) / 5.0 (94)</w:t>
             </w:r>
           </w:p>
         </w:tc>
@@ -242,6 +303,7 @@
     <w:p>
       <w:pPr>
         <w:spacing w:after="0" w:before="60"/>
+        <w:jc w:val="left"/>
       </w:pPr>
       <w:r>
         <w:rPr>
@@ -255,7 +317,7 @@
     <w:p>
       <w:pPr>
         <w:tabs>
-          <w:tab w:val="center" w:pos="5100"/>
+          <w:tab w:val="center" w:pos="5040"/>
         </w:tabs>
         <w:spacing w:after="30" w:before="200"/>
       </w:pPr>
@@ -299,7 +361,7 @@
     </w:p>
     <w:tbl>
       <w:tblPr>
-        <w:tblW w:type="dxa" w:w="9360"/>
+        <w:tblW w:type="dxa" w:w="10080"/>
         <w:tblBorders>
           <w:top w:val="single" w:color="auto" w:sz="4"/>
           <w:left w:val="single" w:color="auto" w:sz="4"/>
@@ -310,15 +372,16 @@
         </w:tblBorders>
       </w:tblPr>
       <w:tblGrid>
-        <w:gridCol w:w="2340"/>
-        <w:gridCol w:w="2340"/>
-        <w:gridCol w:w="2340"/>
-        <w:gridCol w:w="2340"/>
+        <w:gridCol w:w="1800"/>
+        <w:gridCol w:w="1600"/>
+        <w:gridCol w:w="1700"/>
+        <w:gridCol w:w="1700"/>
+        <w:gridCol w:w="3280"/>
       </w:tblGrid>
       <w:tr>
         <w:tc>
           <w:tcPr>
-            <w:tcW w:type="dxa" w:w="2340"/>
+            <w:tcW w:type="dxa" w:w="1800"/>
             <w:tcBorders>
               <w:top w:val="none" w:color="FFFFFF" w:sz="0"/>
               <w:left w:val="none" w:color="FFFFFF" w:sz="0"/>
@@ -328,18 +391,22 @@
             <w:shd w:fill="E6F1FB" w:val="clear"/>
             <w:tcMar>
               <w:top w:type="dxa" w:w="40"/>
-              <w:left w:type="dxa" w:w="80"/>
-              <w:bottom w:type="dxa" w:w="40"/>
-              <w:right w:type="dxa" w:w="80"/>
-            </w:tcMar>
-          </w:tcPr>
-          <w:p>
-            <w:r>
-              <w:rPr>
-                <w:rFonts w:ascii="Arial" w:cs="Arial" w:eastAsia="Arial" w:hAnsi="Arial"/>
-                <w:color w:val="555555"/>
-                <w:sz w:val="17"/>
-                <w:szCs w:val="17"/>
+              <w:left w:type="dxa" w:w="60"/>
+              <w:bottom w:type="dxa" w:w="40"/>
+              <w:right w:type="dxa" w:w="60"/>
+            </w:tcMar>
+            <w:vAlign w:val="center"/>
+          </w:tcPr>
+          <w:p>
+            <w:pPr>
+              <w:jc w:val="center"/>
+            </w:pPr>
+            <w:r>
+              <w:rPr>
+                <w:rFonts w:ascii="Arial" w:cs="Arial" w:eastAsia="Arial" w:hAnsi="Arial"/>
+                <w:color w:val="555555"/>
+                <w:sz w:val="15"/>
+                <w:szCs w:val="15"/>
               </w:rPr>
               <w:t xml:space="preserve">Price: </w:t>
             </w:r>
@@ -348,8 +415,8 @@
                 <w:rFonts w:ascii="Arial" w:cs="Arial" w:eastAsia="Arial" w:hAnsi="Arial"/>
                 <w:b/>
                 <w:bCs/>
-                <w:sz w:val="17"/>
-                <w:szCs w:val="17"/>
+                <w:sz w:val="15"/>
+                <w:szCs w:val="15"/>
               </w:rPr>
               <w:t xml:space="preserve">$100 / $150</w:t>
             </w:r>
@@ -357,7 +424,7 @@
         </w:tc>
         <w:tc>
           <w:tcPr>
-            <w:tcW w:type="dxa" w:w="2340"/>
+            <w:tcW w:type="dxa" w:w="1600"/>
             <w:tcBorders>
               <w:top w:val="none" w:color="FFFFFF" w:sz="0"/>
               <w:left w:val="none" w:color="FFFFFF" w:sz="0"/>
@@ -367,18 +434,22 @@
             <w:shd w:fill="E6F1FB" w:val="clear"/>
             <w:tcMar>
               <w:top w:type="dxa" w:w="40"/>
-              <w:left w:type="dxa" w:w="80"/>
-              <w:bottom w:type="dxa" w:w="40"/>
-              <w:right w:type="dxa" w:w="80"/>
-            </w:tcMar>
-          </w:tcPr>
-          <w:p>
-            <w:r>
-              <w:rPr>
-                <w:rFonts w:ascii="Arial" w:cs="Arial" w:eastAsia="Arial" w:hAnsi="Arial"/>
-                <w:color w:val="555555"/>
-                <w:sz w:val="17"/>
-                <w:szCs w:val="17"/>
+              <w:left w:type="dxa" w:w="60"/>
+              <w:bottom w:type="dxa" w:w="40"/>
+              <w:right w:type="dxa" w:w="60"/>
+            </w:tcMar>
+            <w:vAlign w:val="center"/>
+          </w:tcPr>
+          <w:p>
+            <w:pPr>
+              <w:jc w:val="center"/>
+            </w:pPr>
+            <w:r>
+              <w:rPr>
+                <w:rFonts w:ascii="Arial" w:cs="Arial" w:eastAsia="Arial" w:hAnsi="Arial"/>
+                <w:color w:val="555555"/>
+                <w:sz w:val="15"/>
+                <w:szCs w:val="15"/>
               </w:rPr>
               <w:t xml:space="preserve">Courses: </w:t>
             </w:r>
@@ -387,8 +458,8 @@
                 <w:rFonts w:ascii="Arial" w:cs="Arial" w:eastAsia="Arial" w:hAnsi="Arial"/>
                 <w:b/>
                 <w:bCs/>
-                <w:sz w:val="17"/>
-                <w:szCs w:val="17"/>
+                <w:sz w:val="15"/>
+                <w:szCs w:val="15"/>
               </w:rPr>
               <w:t xml:space="preserve">15 / 17</w:t>
             </w:r>
@@ -396,7 +467,7 @@
         </w:tc>
         <w:tc>
           <w:tcPr>
-            <w:tcW w:type="dxa" w:w="2340"/>
+            <w:tcW w:type="dxa" w:w="1700"/>
             <w:tcBorders>
               <w:top w:val="none" w:color="FFFFFF" w:sz="0"/>
               <w:left w:val="none" w:color="FFFFFF" w:sz="0"/>
@@ -406,18 +477,22 @@
             <w:shd w:fill="E8F5E9" w:val="clear"/>
             <w:tcMar>
               <w:top w:type="dxa" w:w="40"/>
-              <w:left w:type="dxa" w:w="80"/>
-              <w:bottom w:type="dxa" w:w="40"/>
-              <w:right w:type="dxa" w:w="80"/>
-            </w:tcMar>
-          </w:tcPr>
-          <w:p>
-            <w:r>
-              <w:rPr>
-                <w:rFonts w:ascii="Arial" w:cs="Arial" w:eastAsia="Arial" w:hAnsi="Arial"/>
-                <w:color w:val="555555"/>
-                <w:sz w:val="17"/>
-                <w:szCs w:val="17"/>
+              <w:left w:type="dxa" w:w="60"/>
+              <w:bottom w:type="dxa" w:w="40"/>
+              <w:right w:type="dxa" w:w="60"/>
+            </w:tcMar>
+            <w:vAlign w:val="center"/>
+          </w:tcPr>
+          <w:p>
+            <w:pPr>
+              <w:jc w:val="center"/>
+            </w:pPr>
+            <w:r>
+              <w:rPr>
+                <w:rFonts w:ascii="Arial" w:cs="Arial" w:eastAsia="Arial" w:hAnsi="Arial"/>
+                <w:color w:val="555555"/>
+                <w:sz w:val="15"/>
+                <w:szCs w:val="15"/>
               </w:rPr>
               <w:t xml:space="preserve">Session: </w:t>
             </w:r>
@@ -426,8 +501,8 @@
                 <w:rFonts w:ascii="Arial" w:cs="Arial" w:eastAsia="Arial" w:hAnsi="Arial"/>
                 <w:b/>
                 <w:bCs/>
-                <w:sz w:val="17"/>
-                <w:szCs w:val="17"/>
+                <w:sz w:val="15"/>
+                <w:szCs w:val="15"/>
               </w:rPr>
               <w:t xml:space="preserve">75-90 min</w:t>
             </w:r>
@@ -435,7 +510,7 @@
         </w:tc>
         <w:tc>
           <w:tcPr>
-            <w:tcW w:type="dxa" w:w="2340"/>
+            <w:tcW w:type="dxa" w:w="1700"/>
             <w:tcBorders>
               <w:top w:val="none" w:color="FFFFFF" w:sz="0"/>
               <w:left w:val="none" w:color="FFFFFF" w:sz="0"/>
@@ -445,18 +520,22 @@
             <w:shd w:fill="F1EFE8" w:val="clear"/>
             <w:tcMar>
               <w:top w:type="dxa" w:w="40"/>
-              <w:left w:type="dxa" w:w="80"/>
-              <w:bottom w:type="dxa" w:w="40"/>
-              <w:right w:type="dxa" w:w="80"/>
-            </w:tcMar>
-          </w:tcPr>
-          <w:p>
-            <w:r>
-              <w:rPr>
-                <w:rFonts w:ascii="Arial" w:cs="Arial" w:eastAsia="Arial" w:hAnsi="Arial"/>
-                <w:color w:val="555555"/>
-                <w:sz w:val="17"/>
-                <w:szCs w:val="17"/>
+              <w:left w:type="dxa" w:w="60"/>
+              <w:bottom w:type="dxa" w:w="40"/>
+              <w:right w:type="dxa" w:w="60"/>
+            </w:tcMar>
+            <w:vAlign w:val="center"/>
+          </w:tcPr>
+          <w:p>
+            <w:pPr>
+              <w:jc w:val="center"/>
+            </w:pPr>
+            <w:r>
+              <w:rPr>
+                <w:rFonts w:ascii="Arial" w:cs="Arial" w:eastAsia="Arial" w:hAnsi="Arial"/>
+                <w:color w:val="555555"/>
+                <w:sz w:val="15"/>
+                <w:szCs w:val="15"/>
               </w:rPr>
               <w:t xml:space="preserve">BYOB: </w:t>
             </w:r>
@@ -465,10 +544,53 @@
                 <w:rFonts w:ascii="Arial" w:cs="Arial" w:eastAsia="Arial" w:hAnsi="Arial"/>
                 <w:b w:val="false"/>
                 <w:bCs w:val="false"/>
-                <w:sz w:val="17"/>
-                <w:szCs w:val="17"/>
+                <w:sz w:val="15"/>
+                <w:szCs w:val="15"/>
               </w:rPr>
               <w:t xml:space="preserve">No</w:t>
+            </w:r>
+          </w:p>
+        </w:tc>
+        <w:tc>
+          <w:tcPr>
+            <w:tcW w:type="dxa" w:w="3280"/>
+            <w:tcBorders>
+              <w:top w:val="none" w:color="FFFFFF" w:sz="0"/>
+              <w:left w:val="none" w:color="FFFFFF" w:sz="0"/>
+              <w:bottom w:val="none" w:color="FFFFFF" w:sz="0"/>
+              <w:right w:val="none" w:color="FFFFFF" w:sz="0"/>
+            </w:tcBorders>
+            <w:shd w:fill="F0F0F0" w:val="clear"/>
+            <w:tcMar>
+              <w:top w:type="dxa" w:w="40"/>
+              <w:left w:type="dxa" w:w="60"/>
+              <w:bottom w:type="dxa" w:w="40"/>
+              <w:right w:type="dxa" w:w="60"/>
+            </w:tcMar>
+            <w:vAlign w:val="center"/>
+          </w:tcPr>
+          <w:p>
+            <w:pPr>
+              <w:jc w:val="center"/>
+            </w:pPr>
+            <w:r>
+              <w:rPr>
+                <w:rFonts w:ascii="Arial" w:cs="Arial" w:eastAsia="Arial" w:hAnsi="Arial"/>
+                <w:color w:val="555555"/>
+                <w:sz w:val="15"/>
+                <w:szCs w:val="15"/>
+              </w:rPr>
+              <w:t xml:space="preserve">G / Y: </w:t>
+            </w:r>
+            <w:r>
+              <w:rPr>
+                <w:rFonts w:ascii="Arial" w:cs="Arial" w:eastAsia="Arial" w:hAnsi="Arial"/>
+                <w:b/>
+                <w:bCs/>
+                <w:sz w:val="15"/>
+                <w:szCs w:val="15"/>
+              </w:rPr>
+              <w:t xml:space="preserve">5.0 (868) / 5.0 (43)</w:t>
             </w:r>
           </w:p>
         </w:tc>
@@ -477,6 +599,7 @@
     <w:p>
       <w:pPr>
         <w:spacing w:after="0" w:before="60"/>
+        <w:jc w:val="left"/>
       </w:pPr>
       <w:r>
         <w:rPr>
@@ -490,7 +613,7 @@
     <w:p>
       <w:pPr>
         <w:tabs>
-          <w:tab w:val="center" w:pos="5100"/>
+          <w:tab w:val="center" w:pos="5040"/>
         </w:tabs>
         <w:spacing w:after="30" w:before="200"/>
       </w:pPr>
@@ -534,7 +657,7 @@
     </w:p>
     <w:tbl>
       <w:tblPr>
-        <w:tblW w:type="dxa" w:w="9360"/>
+        <w:tblW w:type="dxa" w:w="10080"/>
         <w:tblBorders>
           <w:top w:val="single" w:color="auto" w:sz="4"/>
           <w:left w:val="single" w:color="auto" w:sz="4"/>
@@ -545,15 +668,16 @@
         </w:tblBorders>
       </w:tblPr>
       <w:tblGrid>
-        <w:gridCol w:w="2340"/>
-        <w:gridCol w:w="2340"/>
-        <w:gridCol w:w="2340"/>
-        <w:gridCol w:w="2340"/>
+        <w:gridCol w:w="1800"/>
+        <w:gridCol w:w="1600"/>
+        <w:gridCol w:w="1700"/>
+        <w:gridCol w:w="1700"/>
+        <w:gridCol w:w="3280"/>
       </w:tblGrid>
       <w:tr>
         <w:tc>
           <w:tcPr>
-            <w:tcW w:type="dxa" w:w="2340"/>
+            <w:tcW w:type="dxa" w:w="1800"/>
             <w:tcBorders>
               <w:top w:val="none" w:color="FFFFFF" w:sz="0"/>
               <w:left w:val="none" w:color="FFFFFF" w:sz="0"/>
@@ -563,18 +687,22 @@
             <w:shd w:fill="E6F1FB" w:val="clear"/>
             <w:tcMar>
               <w:top w:type="dxa" w:w="40"/>
-              <w:left w:type="dxa" w:w="80"/>
-              <w:bottom w:type="dxa" w:w="40"/>
-              <w:right w:type="dxa" w:w="80"/>
-            </w:tcMar>
-          </w:tcPr>
-          <w:p>
-            <w:r>
-              <w:rPr>
-                <w:rFonts w:ascii="Arial" w:cs="Arial" w:eastAsia="Arial" w:hAnsi="Arial"/>
-                <w:color w:val="555555"/>
-                <w:sz w:val="17"/>
-                <w:szCs w:val="17"/>
+              <w:left w:type="dxa" w:w="60"/>
+              <w:bottom w:type="dxa" w:w="40"/>
+              <w:right w:type="dxa" w:w="60"/>
+            </w:tcMar>
+            <w:vAlign w:val="center"/>
+          </w:tcPr>
+          <w:p>
+            <w:pPr>
+              <w:jc w:val="center"/>
+            </w:pPr>
+            <w:r>
+              <w:rPr>
+                <w:rFonts w:ascii="Arial" w:cs="Arial" w:eastAsia="Arial" w:hAnsi="Arial"/>
+                <w:color w:val="555555"/>
+                <w:sz w:val="15"/>
+                <w:szCs w:val="15"/>
               </w:rPr>
               <w:t xml:space="preserve">Price: </w:t>
             </w:r>
@@ -583,8 +711,8 @@
                 <w:rFonts w:ascii="Arial" w:cs="Arial" w:eastAsia="Arial" w:hAnsi="Arial"/>
                 <w:b/>
                 <w:bCs/>
-                <w:sz w:val="17"/>
-                <w:szCs w:val="17"/>
+                <w:sz w:val="15"/>
+                <w:szCs w:val="15"/>
               </w:rPr>
               <w:t xml:space="preserve">$89</w:t>
             </w:r>
@@ -592,7 +720,7 @@
         </w:tc>
         <w:tc>
           <w:tcPr>
-            <w:tcW w:type="dxa" w:w="2340"/>
+            <w:tcW w:type="dxa" w:w="1600"/>
             <w:tcBorders>
               <w:top w:val="none" w:color="FFFFFF" w:sz="0"/>
               <w:left w:val="none" w:color="FFFFFF" w:sz="0"/>
@@ -602,18 +730,22 @@
             <w:shd w:fill="E6F1FB" w:val="clear"/>
             <w:tcMar>
               <w:top w:type="dxa" w:w="40"/>
-              <w:left w:type="dxa" w:w="80"/>
-              <w:bottom w:type="dxa" w:w="40"/>
-              <w:right w:type="dxa" w:w="80"/>
-            </w:tcMar>
-          </w:tcPr>
-          <w:p>
-            <w:r>
-              <w:rPr>
-                <w:rFonts w:ascii="Arial" w:cs="Arial" w:eastAsia="Arial" w:hAnsi="Arial"/>
-                <w:color w:val="555555"/>
-                <w:sz w:val="17"/>
-                <w:szCs w:val="17"/>
+              <w:left w:type="dxa" w:w="60"/>
+              <w:bottom w:type="dxa" w:w="40"/>
+              <w:right w:type="dxa" w:w="60"/>
+            </w:tcMar>
+            <w:vAlign w:val="center"/>
+          </w:tcPr>
+          <w:p>
+            <w:pPr>
+              <w:jc w:val="center"/>
+            </w:pPr>
+            <w:r>
+              <w:rPr>
+                <w:rFonts w:ascii="Arial" w:cs="Arial" w:eastAsia="Arial" w:hAnsi="Arial"/>
+                <w:color w:val="555555"/>
+                <w:sz w:val="15"/>
+                <w:szCs w:val="15"/>
               </w:rPr>
               <w:t xml:space="preserve">Courses: </w:t>
             </w:r>
@@ -622,8 +754,8 @@
                 <w:rFonts w:ascii="Arial" w:cs="Arial" w:eastAsia="Arial" w:hAnsi="Arial"/>
                 <w:b/>
                 <w:bCs/>
-                <w:sz w:val="17"/>
-                <w:szCs w:val="17"/>
+                <w:sz w:val="15"/>
+                <w:szCs w:val="15"/>
               </w:rPr>
               <w:t xml:space="preserve">15</w:t>
             </w:r>
@@ -631,7 +763,7 @@
         </w:tc>
         <w:tc>
           <w:tcPr>
-            <w:tcW w:type="dxa" w:w="2340"/>
+            <w:tcW w:type="dxa" w:w="1700"/>
             <w:tcBorders>
               <w:top w:val="none" w:color="FFFFFF" w:sz="0"/>
               <w:left w:val="none" w:color="FFFFFF" w:sz="0"/>
@@ -641,18 +773,22 @@
             <w:shd w:fill="E8F5E9" w:val="clear"/>
             <w:tcMar>
               <w:top w:type="dxa" w:w="40"/>
-              <w:left w:type="dxa" w:w="80"/>
-              <w:bottom w:type="dxa" w:w="40"/>
-              <w:right w:type="dxa" w:w="80"/>
-            </w:tcMar>
-          </w:tcPr>
-          <w:p>
-            <w:r>
-              <w:rPr>
-                <w:rFonts w:ascii="Arial" w:cs="Arial" w:eastAsia="Arial" w:hAnsi="Arial"/>
-                <w:color w:val="555555"/>
-                <w:sz w:val="17"/>
-                <w:szCs w:val="17"/>
+              <w:left w:type="dxa" w:w="60"/>
+              <w:bottom w:type="dxa" w:w="40"/>
+              <w:right w:type="dxa" w:w="60"/>
+            </w:tcMar>
+            <w:vAlign w:val="center"/>
+          </w:tcPr>
+          <w:p>
+            <w:pPr>
+              <w:jc w:val="center"/>
+            </w:pPr>
+            <w:r>
+              <w:rPr>
+                <w:rFonts w:ascii="Arial" w:cs="Arial" w:eastAsia="Arial" w:hAnsi="Arial"/>
+                <w:color w:val="555555"/>
+                <w:sz w:val="15"/>
+                <w:szCs w:val="15"/>
               </w:rPr>
               <w:t xml:space="preserve">Session: </w:t>
             </w:r>
@@ -661,8 +797,8 @@
                 <w:rFonts w:ascii="Arial" w:cs="Arial" w:eastAsia="Arial" w:hAnsi="Arial"/>
                 <w:b/>
                 <w:bCs/>
-                <w:sz w:val="17"/>
-                <w:szCs w:val="17"/>
+                <w:sz w:val="15"/>
+                <w:szCs w:val="15"/>
               </w:rPr>
               <w:t xml:space="preserve">60 min</w:t>
             </w:r>
@@ -670,7 +806,7 @@
         </w:tc>
         <w:tc>
           <w:tcPr>
-            <w:tcW w:type="dxa" w:w="2340"/>
+            <w:tcW w:type="dxa" w:w="1700"/>
             <w:tcBorders>
               <w:top w:val="none" w:color="FFFFFF" w:sz="0"/>
               <w:left w:val="none" w:color="FFFFFF" w:sz="0"/>
@@ -680,18 +816,22 @@
             <w:shd w:fill="F1EFE8" w:val="clear"/>
             <w:tcMar>
               <w:top w:type="dxa" w:w="40"/>
-              <w:left w:type="dxa" w:w="80"/>
-              <w:bottom w:type="dxa" w:w="40"/>
-              <w:right w:type="dxa" w:w="80"/>
-            </w:tcMar>
-          </w:tcPr>
-          <w:p>
-            <w:r>
-              <w:rPr>
-                <w:rFonts w:ascii="Arial" w:cs="Arial" w:eastAsia="Arial" w:hAnsi="Arial"/>
-                <w:color w:val="555555"/>
-                <w:sz w:val="17"/>
-                <w:szCs w:val="17"/>
+              <w:left w:type="dxa" w:w="60"/>
+              <w:bottom w:type="dxa" w:w="40"/>
+              <w:right w:type="dxa" w:w="60"/>
+            </w:tcMar>
+            <w:vAlign w:val="center"/>
+          </w:tcPr>
+          <w:p>
+            <w:pPr>
+              <w:jc w:val="center"/>
+            </w:pPr>
+            <w:r>
+              <w:rPr>
+                <w:rFonts w:ascii="Arial" w:cs="Arial" w:eastAsia="Arial" w:hAnsi="Arial"/>
+                <w:color w:val="555555"/>
+                <w:sz w:val="15"/>
+                <w:szCs w:val="15"/>
               </w:rPr>
               <w:t xml:space="preserve">BYOB: </w:t>
             </w:r>
@@ -700,10 +840,53 @@
                 <w:rFonts w:ascii="Arial" w:cs="Arial" w:eastAsia="Arial" w:hAnsi="Arial"/>
                 <w:b w:val="false"/>
                 <w:bCs w:val="false"/>
-                <w:sz w:val="17"/>
-                <w:szCs w:val="17"/>
+                <w:sz w:val="15"/>
+                <w:szCs w:val="15"/>
               </w:rPr>
               <w:t xml:space="preserve">No</w:t>
+            </w:r>
+          </w:p>
+        </w:tc>
+        <w:tc>
+          <w:tcPr>
+            <w:tcW w:type="dxa" w:w="3280"/>
+            <w:tcBorders>
+              <w:top w:val="none" w:color="FFFFFF" w:sz="0"/>
+              <w:left w:val="none" w:color="FFFFFF" w:sz="0"/>
+              <w:bottom w:val="none" w:color="FFFFFF" w:sz="0"/>
+              <w:right w:val="none" w:color="FFFFFF" w:sz="0"/>
+            </w:tcBorders>
+            <w:shd w:fill="F0F0F0" w:val="clear"/>
+            <w:tcMar>
+              <w:top w:type="dxa" w:w="40"/>
+              <w:left w:type="dxa" w:w="60"/>
+              <w:bottom w:type="dxa" w:w="40"/>
+              <w:right w:type="dxa" w:w="60"/>
+            </w:tcMar>
+            <w:vAlign w:val="center"/>
+          </w:tcPr>
+          <w:p>
+            <w:pPr>
+              <w:jc w:val="center"/>
+            </w:pPr>
+            <w:r>
+              <w:rPr>
+                <w:rFonts w:ascii="Arial" w:cs="Arial" w:eastAsia="Arial" w:hAnsi="Arial"/>
+                <w:color w:val="555555"/>
+                <w:sz w:val="15"/>
+                <w:szCs w:val="15"/>
+              </w:rPr>
+              <w:t xml:space="preserve">G / Y: </w:t>
+            </w:r>
+            <w:r>
+              <w:rPr>
+                <w:rFonts w:ascii="Arial" w:cs="Arial" w:eastAsia="Arial" w:hAnsi="Arial"/>
+                <w:b/>
+                <w:bCs/>
+                <w:sz w:val="15"/>
+                <w:szCs w:val="15"/>
+              </w:rPr>
+              <w:t xml:space="preserve">4.8 (654) / 4.8 (546)</w:t>
             </w:r>
           </w:p>
         </w:tc>
@@ -712,6 +895,7 @@
     <w:p>
       <w:pPr>
         <w:spacing w:after="0" w:before="60"/>
+        <w:jc w:val="left"/>
       </w:pPr>
       <w:r>
         <w:rPr>
@@ -724,36 +908,34 @@
     </w:p>
     <w:p>
       <w:pPr>
-        <w:spacing w:after="4" w:before="200"/>
-      </w:pPr>
+        <w:tabs>
+          <w:tab w:val="center" w:pos="5040"/>
+        </w:tabs>
+        <w:spacing w:after="30" w:before="200"/>
+      </w:pPr>
+      <w:r>
+        <w:rPr>
+          <w:rFonts w:ascii="Arial" w:cs="Arial" w:eastAsia="Arial" w:hAnsi="Arial"/>
+          <w:color w:val="888888"/>
+          <w:sz w:val="19"/>
+          <w:szCs w:val="19"/>
+        </w:rPr>
+        <w:t xml:space="preserve">#4</w:t>
+      </w:r>
+      <w:r>
+        <w:t xml:space="preserve">  </w:t>
+      </w:r>
       <w:r>
         <w:rPr>
           <w:rFonts w:ascii="Arial" w:cs="Arial" w:eastAsia="Arial" w:hAnsi="Arial"/>
           <w:b/>
           <w:bCs/>
           <w:color w:val="E8900C"/>
-          <w:sz w:val="15"/>
-          <w:szCs w:val="15"/>
+          <w:sz w:val="14"/>
+          <w:szCs w:val="14"/>
           <w:shd w:fill="FFF3E0" w:val="clear"/>
         </w:rPr>
-        <w:t xml:space="preserve">  Friend recommendation  </w:t>
-      </w:r>
-    </w:p>
-    <w:p>
-      <w:pPr>
-        <w:tabs>
-          <w:tab w:val="center" w:pos="5100"/>
-        </w:tabs>
-        <w:spacing w:after="30" w:before="4"/>
-      </w:pPr>
-      <w:r>
-        <w:rPr>
-          <w:rFonts w:ascii="Arial" w:cs="Arial" w:eastAsia="Arial" w:hAnsi="Arial"/>
-          <w:color w:val="888888"/>
-          <w:sz w:val="19"/>
-          <w:szCs w:val="19"/>
-        </w:rPr>
-        <w:t xml:space="preserve">#4</w:t>
+        <w:t xml:space="preserve"> Friend rec </w:t>
       </w:r>
       <w:r>
         <w:t xml:space="preserve">	</w:t>
@@ -786,7 +968,7 @@
     </w:p>
     <w:tbl>
       <w:tblPr>
-        <w:tblW w:type="dxa" w:w="9360"/>
+        <w:tblW w:type="dxa" w:w="10080"/>
         <w:tblBorders>
           <w:top w:val="single" w:color="auto" w:sz="4"/>
           <w:left w:val="single" w:color="auto" w:sz="4"/>
@@ -797,15 +979,16 @@
         </w:tblBorders>
       </w:tblPr>
       <w:tblGrid>
-        <w:gridCol w:w="2340"/>
-        <w:gridCol w:w="2340"/>
-        <w:gridCol w:w="2340"/>
-        <w:gridCol w:w="2340"/>
+        <w:gridCol w:w="1800"/>
+        <w:gridCol w:w="1600"/>
+        <w:gridCol w:w="1700"/>
+        <w:gridCol w:w="1700"/>
+        <w:gridCol w:w="3280"/>
       </w:tblGrid>
       <w:tr>
         <w:tc>
           <w:tcPr>
-            <w:tcW w:type="dxa" w:w="2340"/>
+            <w:tcW w:type="dxa" w:w="1800"/>
             <w:tcBorders>
               <w:top w:val="none" w:color="FFFFFF" w:sz="0"/>
               <w:left w:val="none" w:color="FFFFFF" w:sz="0"/>
@@ -815,18 +998,22 @@
             <w:shd w:fill="E6F1FB" w:val="clear"/>
             <w:tcMar>
               <w:top w:type="dxa" w:w="40"/>
-              <w:left w:type="dxa" w:w="80"/>
-              <w:bottom w:type="dxa" w:w="40"/>
-              <w:right w:type="dxa" w:w="80"/>
-            </w:tcMar>
-          </w:tcPr>
-          <w:p>
-            <w:r>
-              <w:rPr>
-                <w:rFonts w:ascii="Arial" w:cs="Arial" w:eastAsia="Arial" w:hAnsi="Arial"/>
-                <w:color w:val="555555"/>
-                <w:sz w:val="17"/>
-                <w:szCs w:val="17"/>
+              <w:left w:type="dxa" w:w="60"/>
+              <w:bottom w:type="dxa" w:w="40"/>
+              <w:right w:type="dxa" w:w="60"/>
+            </w:tcMar>
+            <w:vAlign w:val="center"/>
+          </w:tcPr>
+          <w:p>
+            <w:pPr>
+              <w:jc w:val="center"/>
+            </w:pPr>
+            <w:r>
+              <w:rPr>
+                <w:rFonts w:ascii="Arial" w:cs="Arial" w:eastAsia="Arial" w:hAnsi="Arial"/>
+                <w:color w:val="555555"/>
+                <w:sz w:val="15"/>
+                <w:szCs w:val="15"/>
               </w:rPr>
               <w:t xml:space="preserve">Price: </w:t>
             </w:r>
@@ -835,8 +1022,8 @@
                 <w:rFonts w:ascii="Arial" w:cs="Arial" w:eastAsia="Arial" w:hAnsi="Arial"/>
                 <w:b/>
                 <w:bCs/>
-                <w:sz w:val="17"/>
-                <w:szCs w:val="17"/>
+                <w:sz w:val="15"/>
+                <w:szCs w:val="15"/>
               </w:rPr>
               <w:t xml:space="preserve">$75-85</w:t>
             </w:r>
@@ -844,7 +1031,7 @@
         </w:tc>
         <w:tc>
           <w:tcPr>
-            <w:tcW w:type="dxa" w:w="2340"/>
+            <w:tcW w:type="dxa" w:w="1600"/>
             <w:tcBorders>
               <w:top w:val="none" w:color="FFFFFF" w:sz="0"/>
               <w:left w:val="none" w:color="FFFFFF" w:sz="0"/>
@@ -854,18 +1041,22 @@
             <w:shd w:fill="E6F1FB" w:val="clear"/>
             <w:tcMar>
               <w:top w:type="dxa" w:w="40"/>
-              <w:left w:type="dxa" w:w="80"/>
-              <w:bottom w:type="dxa" w:w="40"/>
-              <w:right w:type="dxa" w:w="80"/>
-            </w:tcMar>
-          </w:tcPr>
-          <w:p>
-            <w:r>
-              <w:rPr>
-                <w:rFonts w:ascii="Arial" w:cs="Arial" w:eastAsia="Arial" w:hAnsi="Arial"/>
-                <w:color w:val="555555"/>
-                <w:sz w:val="17"/>
-                <w:szCs w:val="17"/>
+              <w:left w:type="dxa" w:w="60"/>
+              <w:bottom w:type="dxa" w:w="40"/>
+              <w:right w:type="dxa" w:w="60"/>
+            </w:tcMar>
+            <w:vAlign w:val="center"/>
+          </w:tcPr>
+          <w:p>
+            <w:pPr>
+              <w:jc w:val="center"/>
+            </w:pPr>
+            <w:r>
+              <w:rPr>
+                <w:rFonts w:ascii="Arial" w:cs="Arial" w:eastAsia="Arial" w:hAnsi="Arial"/>
+                <w:color w:val="555555"/>
+                <w:sz w:val="15"/>
+                <w:szCs w:val="15"/>
               </w:rPr>
               <w:t xml:space="preserve">Courses: </w:t>
             </w:r>
@@ -874,8 +1065,8 @@
                 <w:rFonts w:ascii="Arial" w:cs="Arial" w:eastAsia="Arial" w:hAnsi="Arial"/>
                 <w:b/>
                 <w:bCs/>
-                <w:sz w:val="17"/>
-                <w:szCs w:val="17"/>
+                <w:sz w:val="15"/>
+                <w:szCs w:val="15"/>
               </w:rPr>
               <w:t xml:space="preserve">15</w:t>
             </w:r>
@@ -883,7 +1074,7 @@
         </w:tc>
         <w:tc>
           <w:tcPr>
-            <w:tcW w:type="dxa" w:w="2340"/>
+            <w:tcW w:type="dxa" w:w="1700"/>
             <w:tcBorders>
               <w:top w:val="none" w:color="FFFFFF" w:sz="0"/>
               <w:left w:val="none" w:color="FFFFFF" w:sz="0"/>
@@ -893,18 +1084,22 @@
             <w:shd w:fill="E8F5E9" w:val="clear"/>
             <w:tcMar>
               <w:top w:type="dxa" w:w="40"/>
-              <w:left w:type="dxa" w:w="80"/>
-              <w:bottom w:type="dxa" w:w="40"/>
-              <w:right w:type="dxa" w:w="80"/>
-            </w:tcMar>
-          </w:tcPr>
-          <w:p>
-            <w:r>
-              <w:rPr>
-                <w:rFonts w:ascii="Arial" w:cs="Arial" w:eastAsia="Arial" w:hAnsi="Arial"/>
-                <w:color w:val="555555"/>
-                <w:sz w:val="17"/>
-                <w:szCs w:val="17"/>
+              <w:left w:type="dxa" w:w="60"/>
+              <w:bottom w:type="dxa" w:w="40"/>
+              <w:right w:type="dxa" w:w="60"/>
+            </w:tcMar>
+            <w:vAlign w:val="center"/>
+          </w:tcPr>
+          <w:p>
+            <w:pPr>
+              <w:jc w:val="center"/>
+            </w:pPr>
+            <w:r>
+              <w:rPr>
+                <w:rFonts w:ascii="Arial" w:cs="Arial" w:eastAsia="Arial" w:hAnsi="Arial"/>
+                <w:color w:val="555555"/>
+                <w:sz w:val="15"/>
+                <w:szCs w:val="15"/>
               </w:rPr>
               <w:t xml:space="preserve">Session: </w:t>
             </w:r>
@@ -913,8 +1108,8 @@
                 <w:rFonts w:ascii="Arial" w:cs="Arial" w:eastAsia="Arial" w:hAnsi="Arial"/>
                 <w:b/>
                 <w:bCs/>
-                <w:sz w:val="17"/>
-                <w:szCs w:val="17"/>
+                <w:sz w:val="15"/>
+                <w:szCs w:val="15"/>
               </w:rPr>
               <w:t xml:space="preserve">75-90 min</w:t>
             </w:r>
@@ -922,7 +1117,7 @@
         </w:tc>
         <w:tc>
           <w:tcPr>
-            <w:tcW w:type="dxa" w:w="2340"/>
+            <w:tcW w:type="dxa" w:w="1700"/>
             <w:tcBorders>
               <w:top w:val="none" w:color="FFFFFF" w:sz="0"/>
               <w:left w:val="none" w:color="FFFFFF" w:sz="0"/>
@@ -932,18 +1127,22 @@
             <w:shd w:fill="F1EFE8" w:val="clear"/>
             <w:tcMar>
               <w:top w:type="dxa" w:w="40"/>
-              <w:left w:type="dxa" w:w="80"/>
-              <w:bottom w:type="dxa" w:w="40"/>
-              <w:right w:type="dxa" w:w="80"/>
-            </w:tcMar>
-          </w:tcPr>
-          <w:p>
-            <w:r>
-              <w:rPr>
-                <w:rFonts w:ascii="Arial" w:cs="Arial" w:eastAsia="Arial" w:hAnsi="Arial"/>
-                <w:color w:val="555555"/>
-                <w:sz w:val="17"/>
-                <w:szCs w:val="17"/>
+              <w:left w:type="dxa" w:w="60"/>
+              <w:bottom w:type="dxa" w:w="40"/>
+              <w:right w:type="dxa" w:w="60"/>
+            </w:tcMar>
+            <w:vAlign w:val="center"/>
+          </w:tcPr>
+          <w:p>
+            <w:pPr>
+              <w:jc w:val="center"/>
+            </w:pPr>
+            <w:r>
+              <w:rPr>
+                <w:rFonts w:ascii="Arial" w:cs="Arial" w:eastAsia="Arial" w:hAnsi="Arial"/>
+                <w:color w:val="555555"/>
+                <w:sz w:val="15"/>
+                <w:szCs w:val="15"/>
               </w:rPr>
               <w:t xml:space="preserve">BYOB: </w:t>
             </w:r>
@@ -952,10 +1151,53 @@
                 <w:rFonts w:ascii="Arial" w:cs="Arial" w:eastAsia="Arial" w:hAnsi="Arial"/>
                 <w:b/>
                 <w:bCs/>
-                <w:sz w:val="17"/>
-                <w:szCs w:val="17"/>
+                <w:sz w:val="15"/>
+                <w:szCs w:val="15"/>
               </w:rPr>
               <w:t xml:space="preserve">Yes</w:t>
+            </w:r>
+          </w:p>
+        </w:tc>
+        <w:tc>
+          <w:tcPr>
+            <w:tcW w:type="dxa" w:w="3280"/>
+            <w:tcBorders>
+              <w:top w:val="none" w:color="FFFFFF" w:sz="0"/>
+              <w:left w:val="none" w:color="FFFFFF" w:sz="0"/>
+              <w:bottom w:val="none" w:color="FFFFFF" w:sz="0"/>
+              <w:right w:val="none" w:color="FFFFFF" w:sz="0"/>
+            </w:tcBorders>
+            <w:shd w:fill="F0F0F0" w:val="clear"/>
+            <w:tcMar>
+              <w:top w:type="dxa" w:w="40"/>
+              <w:left w:type="dxa" w:w="60"/>
+              <w:bottom w:type="dxa" w:w="40"/>
+              <w:right w:type="dxa" w:w="60"/>
+            </w:tcMar>
+            <w:vAlign w:val="center"/>
+          </w:tcPr>
+          <w:p>
+            <w:pPr>
+              <w:jc w:val="center"/>
+            </w:pPr>
+            <w:r>
+              <w:rPr>
+                <w:rFonts w:ascii="Arial" w:cs="Arial" w:eastAsia="Arial" w:hAnsi="Arial"/>
+                <w:color w:val="555555"/>
+                <w:sz w:val="15"/>
+                <w:szCs w:val="15"/>
+              </w:rPr>
+              <w:t xml:space="preserve">G / Y: </w:t>
+            </w:r>
+            <w:r>
+              <w:rPr>
+                <w:rFonts w:ascii="Arial" w:cs="Arial" w:eastAsia="Arial" w:hAnsi="Arial"/>
+                <w:b/>
+                <w:bCs/>
+                <w:sz w:val="15"/>
+                <w:szCs w:val="15"/>
+              </w:rPr>
+              <w:t xml:space="preserve">4.9 (219) / -</w:t>
             </w:r>
           </w:p>
         </w:tc>
@@ -964,6 +1206,7 @@
     <w:p>
       <w:pPr>
         <w:spacing w:after="0" w:before="60"/>
+        <w:jc w:val="left"/>
       </w:pPr>
       <w:r>
         <w:rPr>
@@ -971,13 +1214,13 @@
           <w:sz w:val="19"/>
           <w:szCs w:val="19"/>
         </w:rPr>
-        <w:t xml:space="preserve">15 courses at a very accessible price point. Chef-driven LES spot known for creative presentations and a signature fire course that's blown up on social media. Intimate room, fresh fish, strong neighborhood following. 4.9 on Google (219 reviews).</w:t>
+        <w:t xml:space="preserve">15 courses at a very accessible price point. Chef-driven LES spot known for creative presentations and a signature fire course. Intimate room, fresh fish, strong neighborhood following.</w:t>
       </w:r>
     </w:p>
     <w:p>
       <w:pPr>
         <w:tabs>
-          <w:tab w:val="center" w:pos="5100"/>
+          <w:tab w:val="center" w:pos="5040"/>
         </w:tabs>
         <w:spacing w:after="30" w:before="200"/>
       </w:pPr>
@@ -1021,7 +1264,7 @@
     </w:p>
     <w:tbl>
       <w:tblPr>
-        <w:tblW w:type="dxa" w:w="9360"/>
+        <w:tblW w:type="dxa" w:w="10080"/>
         <w:tblBorders>
           <w:top w:val="single" w:color="auto" w:sz="4"/>
           <w:left w:val="single" w:color="auto" w:sz="4"/>
@@ -1032,15 +1275,16 @@
         </w:tblBorders>
       </w:tblPr>
       <w:tblGrid>
-        <w:gridCol w:w="2340"/>
-        <w:gridCol w:w="2340"/>
-        <w:gridCol w:w="2340"/>
-        <w:gridCol w:w="2340"/>
+        <w:gridCol w:w="1800"/>
+        <w:gridCol w:w="1600"/>
+        <w:gridCol w:w="1700"/>
+        <w:gridCol w:w="1700"/>
+        <w:gridCol w:w="3280"/>
       </w:tblGrid>
       <w:tr>
         <w:tc>
           <w:tcPr>
-            <w:tcW w:type="dxa" w:w="2340"/>
+            <w:tcW w:type="dxa" w:w="1800"/>
             <w:tcBorders>
               <w:top w:val="none" w:color="FFFFFF" w:sz="0"/>
               <w:left w:val="none" w:color="FFFFFF" w:sz="0"/>
@@ -1050,18 +1294,22 @@
             <w:shd w:fill="E6F1FB" w:val="clear"/>
             <w:tcMar>
               <w:top w:type="dxa" w:w="40"/>
-              <w:left w:type="dxa" w:w="80"/>
-              <w:bottom w:type="dxa" w:w="40"/>
-              <w:right w:type="dxa" w:w="80"/>
-            </w:tcMar>
-          </w:tcPr>
-          <w:p>
-            <w:r>
-              <w:rPr>
-                <w:rFonts w:ascii="Arial" w:cs="Arial" w:eastAsia="Arial" w:hAnsi="Arial"/>
-                <w:color w:val="555555"/>
-                <w:sz w:val="17"/>
-                <w:szCs w:val="17"/>
+              <w:left w:type="dxa" w:w="60"/>
+              <w:bottom w:type="dxa" w:w="40"/>
+              <w:right w:type="dxa" w:w="60"/>
+            </w:tcMar>
+            <w:vAlign w:val="center"/>
+          </w:tcPr>
+          <w:p>
+            <w:pPr>
+              <w:jc w:val="center"/>
+            </w:pPr>
+            <w:r>
+              <w:rPr>
+                <w:rFonts w:ascii="Arial" w:cs="Arial" w:eastAsia="Arial" w:hAnsi="Arial"/>
+                <w:color w:val="555555"/>
+                <w:sz w:val="15"/>
+                <w:szCs w:val="15"/>
               </w:rPr>
               <w:t xml:space="preserve">Price: </w:t>
             </w:r>
@@ -1070,8 +1318,8 @@
                 <w:rFonts w:ascii="Arial" w:cs="Arial" w:eastAsia="Arial" w:hAnsi="Arial"/>
                 <w:b/>
                 <w:bCs/>
-                <w:sz w:val="17"/>
-                <w:szCs w:val="17"/>
+                <w:sz w:val="15"/>
+                <w:szCs w:val="15"/>
               </w:rPr>
               <w:t xml:space="preserve">$120</w:t>
             </w:r>
@@ -1079,7 +1327,7 @@
         </w:tc>
         <w:tc>
           <w:tcPr>
-            <w:tcW w:type="dxa" w:w="2340"/>
+            <w:tcW w:type="dxa" w:w="1600"/>
             <w:tcBorders>
               <w:top w:val="none" w:color="FFFFFF" w:sz="0"/>
               <w:left w:val="none" w:color="FFFFFF" w:sz="0"/>
@@ -1089,18 +1337,22 @@
             <w:shd w:fill="E6F1FB" w:val="clear"/>
             <w:tcMar>
               <w:top w:type="dxa" w:w="40"/>
-              <w:left w:type="dxa" w:w="80"/>
-              <w:bottom w:type="dxa" w:w="40"/>
-              <w:right w:type="dxa" w:w="80"/>
-            </w:tcMar>
-          </w:tcPr>
-          <w:p>
-            <w:r>
-              <w:rPr>
-                <w:rFonts w:ascii="Arial" w:cs="Arial" w:eastAsia="Arial" w:hAnsi="Arial"/>
-                <w:color w:val="555555"/>
-                <w:sz w:val="17"/>
-                <w:szCs w:val="17"/>
+              <w:left w:type="dxa" w:w="60"/>
+              <w:bottom w:type="dxa" w:w="40"/>
+              <w:right w:type="dxa" w:w="60"/>
+            </w:tcMar>
+            <w:vAlign w:val="center"/>
+          </w:tcPr>
+          <w:p>
+            <w:pPr>
+              <w:jc w:val="center"/>
+            </w:pPr>
+            <w:r>
+              <w:rPr>
+                <w:rFonts w:ascii="Arial" w:cs="Arial" w:eastAsia="Arial" w:hAnsi="Arial"/>
+                <w:color w:val="555555"/>
+                <w:sz w:val="15"/>
+                <w:szCs w:val="15"/>
               </w:rPr>
               <w:t xml:space="preserve">Courses: </w:t>
             </w:r>
@@ -1109,8 +1361,8 @@
                 <w:rFonts w:ascii="Arial" w:cs="Arial" w:eastAsia="Arial" w:hAnsi="Arial"/>
                 <w:b/>
                 <w:bCs/>
-                <w:sz w:val="17"/>
-                <w:szCs w:val="17"/>
+                <w:sz w:val="15"/>
+                <w:szCs w:val="15"/>
               </w:rPr>
               <w:t xml:space="preserve">17</w:t>
             </w:r>
@@ -1118,7 +1370,7 @@
         </w:tc>
         <w:tc>
           <w:tcPr>
-            <w:tcW w:type="dxa" w:w="2340"/>
+            <w:tcW w:type="dxa" w:w="1700"/>
             <w:tcBorders>
               <w:top w:val="none" w:color="FFFFFF" w:sz="0"/>
               <w:left w:val="none" w:color="FFFFFF" w:sz="0"/>
@@ -1128,18 +1380,22 @@
             <w:shd w:fill="E8F5E9" w:val="clear"/>
             <w:tcMar>
               <w:top w:type="dxa" w:w="40"/>
-              <w:left w:type="dxa" w:w="80"/>
-              <w:bottom w:type="dxa" w:w="40"/>
-              <w:right w:type="dxa" w:w="80"/>
-            </w:tcMar>
-          </w:tcPr>
-          <w:p>
-            <w:r>
-              <w:rPr>
-                <w:rFonts w:ascii="Arial" w:cs="Arial" w:eastAsia="Arial" w:hAnsi="Arial"/>
-                <w:color w:val="555555"/>
-                <w:sz w:val="17"/>
-                <w:szCs w:val="17"/>
+              <w:left w:type="dxa" w:w="60"/>
+              <w:bottom w:type="dxa" w:w="40"/>
+              <w:right w:type="dxa" w:w="60"/>
+            </w:tcMar>
+            <w:vAlign w:val="center"/>
+          </w:tcPr>
+          <w:p>
+            <w:pPr>
+              <w:jc w:val="center"/>
+            </w:pPr>
+            <w:r>
+              <w:rPr>
+                <w:rFonts w:ascii="Arial" w:cs="Arial" w:eastAsia="Arial" w:hAnsi="Arial"/>
+                <w:color w:val="555555"/>
+                <w:sz w:val="15"/>
+                <w:szCs w:val="15"/>
               </w:rPr>
               <w:t xml:space="preserve">Session: </w:t>
             </w:r>
@@ -1148,8 +1404,8 @@
                 <w:rFonts w:ascii="Arial" w:cs="Arial" w:eastAsia="Arial" w:hAnsi="Arial"/>
                 <w:b/>
                 <w:bCs/>
-                <w:sz w:val="17"/>
-                <w:szCs w:val="17"/>
+                <w:sz w:val="15"/>
+                <w:szCs w:val="15"/>
               </w:rPr>
               <w:t xml:space="preserve">75-90 min</w:t>
             </w:r>
@@ -1157,7 +1413,7 @@
         </w:tc>
         <w:tc>
           <w:tcPr>
-            <w:tcW w:type="dxa" w:w="2340"/>
+            <w:tcW w:type="dxa" w:w="1700"/>
             <w:tcBorders>
               <w:top w:val="none" w:color="FFFFFF" w:sz="0"/>
               <w:left w:val="none" w:color="FFFFFF" w:sz="0"/>
@@ -1167,18 +1423,22 @@
             <w:shd w:fill="F1EFE8" w:val="clear"/>
             <w:tcMar>
               <w:top w:type="dxa" w:w="40"/>
-              <w:left w:type="dxa" w:w="80"/>
-              <w:bottom w:type="dxa" w:w="40"/>
-              <w:right w:type="dxa" w:w="80"/>
-            </w:tcMar>
-          </w:tcPr>
-          <w:p>
-            <w:r>
-              <w:rPr>
-                <w:rFonts w:ascii="Arial" w:cs="Arial" w:eastAsia="Arial" w:hAnsi="Arial"/>
-                <w:color w:val="555555"/>
-                <w:sz w:val="17"/>
-                <w:szCs w:val="17"/>
+              <w:left w:type="dxa" w:w="60"/>
+              <w:bottom w:type="dxa" w:w="40"/>
+              <w:right w:type="dxa" w:w="60"/>
+            </w:tcMar>
+            <w:vAlign w:val="center"/>
+          </w:tcPr>
+          <w:p>
+            <w:pPr>
+              <w:jc w:val="center"/>
+            </w:pPr>
+            <w:r>
+              <w:rPr>
+                <w:rFonts w:ascii="Arial" w:cs="Arial" w:eastAsia="Arial" w:hAnsi="Arial"/>
+                <w:color w:val="555555"/>
+                <w:sz w:val="15"/>
+                <w:szCs w:val="15"/>
               </w:rPr>
               <w:t xml:space="preserve">BYOB: </w:t>
             </w:r>
@@ -1187,10 +1447,53 @@
                 <w:rFonts w:ascii="Arial" w:cs="Arial" w:eastAsia="Arial" w:hAnsi="Arial"/>
                 <w:b w:val="false"/>
                 <w:bCs w:val="false"/>
-                <w:sz w:val="17"/>
-                <w:szCs w:val="17"/>
+                <w:sz w:val="15"/>
+                <w:szCs w:val="15"/>
               </w:rPr>
               <w:t xml:space="preserve">No</w:t>
+            </w:r>
+          </w:p>
+        </w:tc>
+        <w:tc>
+          <w:tcPr>
+            <w:tcW w:type="dxa" w:w="3280"/>
+            <w:tcBorders>
+              <w:top w:val="none" w:color="FFFFFF" w:sz="0"/>
+              <w:left w:val="none" w:color="FFFFFF" w:sz="0"/>
+              <w:bottom w:val="none" w:color="FFFFFF" w:sz="0"/>
+              <w:right w:val="none" w:color="FFFFFF" w:sz="0"/>
+            </w:tcBorders>
+            <w:shd w:fill="F0F0F0" w:val="clear"/>
+            <w:tcMar>
+              <w:top w:type="dxa" w:w="40"/>
+              <w:left w:type="dxa" w:w="60"/>
+              <w:bottom w:type="dxa" w:w="40"/>
+              <w:right w:type="dxa" w:w="60"/>
+            </w:tcMar>
+            <w:vAlign w:val="center"/>
+          </w:tcPr>
+          <w:p>
+            <w:pPr>
+              <w:jc w:val="center"/>
+            </w:pPr>
+            <w:r>
+              <w:rPr>
+                <w:rFonts w:ascii="Arial" w:cs="Arial" w:eastAsia="Arial" w:hAnsi="Arial"/>
+                <w:color w:val="555555"/>
+                <w:sz w:val="15"/>
+                <w:szCs w:val="15"/>
+              </w:rPr>
+              <w:t xml:space="preserve">G / Y: </w:t>
+            </w:r>
+            <w:r>
+              <w:rPr>
+                <w:rFonts w:ascii="Arial" w:cs="Arial" w:eastAsia="Arial" w:hAnsi="Arial"/>
+                <w:b/>
+                <w:bCs/>
+                <w:sz w:val="15"/>
+                <w:szCs w:val="15"/>
+              </w:rPr>
+              <w:t xml:space="preserve">4.9 (277) / 5.0 (36)</w:t>
             </w:r>
           </w:p>
         </w:tc>
@@ -1199,6 +1502,7 @@
     <w:p>
       <w:pPr>
         <w:spacing w:after="0" w:before="60"/>
+        <w:jc w:val="left"/>
       </w:pPr>
       <w:r>
         <w:rPr>
@@ -1212,7 +1516,7 @@
     <w:p>
       <w:pPr>
         <w:tabs>
-          <w:tab w:val="center" w:pos="5100"/>
+          <w:tab w:val="center" w:pos="5040"/>
         </w:tabs>
         <w:spacing w:after="30" w:before="200"/>
       </w:pPr>
@@ -1256,7 +1560,7 @@
     </w:p>
     <w:tbl>
       <w:tblPr>
-        <w:tblW w:type="dxa" w:w="9360"/>
+        <w:tblW w:type="dxa" w:w="10080"/>
         <w:tblBorders>
           <w:top w:val="single" w:color="auto" w:sz="4"/>
           <w:left w:val="single" w:color="auto" w:sz="4"/>
@@ -1267,15 +1571,16 @@
         </w:tblBorders>
       </w:tblPr>
       <w:tblGrid>
-        <w:gridCol w:w="2340"/>
-        <w:gridCol w:w="2340"/>
-        <w:gridCol w:w="2340"/>
-        <w:gridCol w:w="2340"/>
+        <w:gridCol w:w="1800"/>
+        <w:gridCol w:w="1600"/>
+        <w:gridCol w:w="1700"/>
+        <w:gridCol w:w="1700"/>
+        <w:gridCol w:w="3280"/>
       </w:tblGrid>
       <w:tr>
         <w:tc>
           <w:tcPr>
-            <w:tcW w:type="dxa" w:w="2340"/>
+            <w:tcW w:type="dxa" w:w="1800"/>
             <w:tcBorders>
               <w:top w:val="none" w:color="FFFFFF" w:sz="0"/>
               <w:left w:val="none" w:color="FFFFFF" w:sz="0"/>
@@ -1285,18 +1590,22 @@
             <w:shd w:fill="E6F1FB" w:val="clear"/>
             <w:tcMar>
               <w:top w:type="dxa" w:w="40"/>
-              <w:left w:type="dxa" w:w="80"/>
-              <w:bottom w:type="dxa" w:w="40"/>
-              <w:right w:type="dxa" w:w="80"/>
-            </w:tcMar>
-          </w:tcPr>
-          <w:p>
-            <w:r>
-              <w:rPr>
-                <w:rFonts w:ascii="Arial" w:cs="Arial" w:eastAsia="Arial" w:hAnsi="Arial"/>
-                <w:color w:val="555555"/>
-                <w:sz w:val="17"/>
-                <w:szCs w:val="17"/>
+              <w:left w:type="dxa" w:w="60"/>
+              <w:bottom w:type="dxa" w:w="40"/>
+              <w:right w:type="dxa" w:w="60"/>
+            </w:tcMar>
+            <w:vAlign w:val="center"/>
+          </w:tcPr>
+          <w:p>
+            <w:pPr>
+              <w:jc w:val="center"/>
+            </w:pPr>
+            <w:r>
+              <w:rPr>
+                <w:rFonts w:ascii="Arial" w:cs="Arial" w:eastAsia="Arial" w:hAnsi="Arial"/>
+                <w:color w:val="555555"/>
+                <w:sz w:val="15"/>
+                <w:szCs w:val="15"/>
               </w:rPr>
               <w:t xml:space="preserve">Price: </w:t>
             </w:r>
@@ -1305,8 +1614,8 @@
                 <w:rFonts w:ascii="Arial" w:cs="Arial" w:eastAsia="Arial" w:hAnsi="Arial"/>
                 <w:b/>
                 <w:bCs/>
-                <w:sz w:val="17"/>
-                <w:szCs w:val="17"/>
+                <w:sz w:val="15"/>
+                <w:szCs w:val="15"/>
               </w:rPr>
               <w:t xml:space="preserve">$69 / $138</w:t>
             </w:r>
@@ -1314,7 +1623,7 @@
         </w:tc>
         <w:tc>
           <w:tcPr>
-            <w:tcW w:type="dxa" w:w="2340"/>
+            <w:tcW w:type="dxa" w:w="1600"/>
             <w:tcBorders>
               <w:top w:val="none" w:color="FFFFFF" w:sz="0"/>
               <w:left w:val="none" w:color="FFFFFF" w:sz="0"/>
@@ -1324,18 +1633,22 @@
             <w:shd w:fill="E6F1FB" w:val="clear"/>
             <w:tcMar>
               <w:top w:type="dxa" w:w="40"/>
-              <w:left w:type="dxa" w:w="80"/>
-              <w:bottom w:type="dxa" w:w="40"/>
-              <w:right w:type="dxa" w:w="80"/>
-            </w:tcMar>
-          </w:tcPr>
-          <w:p>
-            <w:r>
-              <w:rPr>
-                <w:rFonts w:ascii="Arial" w:cs="Arial" w:eastAsia="Arial" w:hAnsi="Arial"/>
-                <w:color w:val="555555"/>
-                <w:sz w:val="17"/>
-                <w:szCs w:val="17"/>
+              <w:left w:type="dxa" w:w="60"/>
+              <w:bottom w:type="dxa" w:w="40"/>
+              <w:right w:type="dxa" w:w="60"/>
+            </w:tcMar>
+            <w:vAlign w:val="center"/>
+          </w:tcPr>
+          <w:p>
+            <w:pPr>
+              <w:jc w:val="center"/>
+            </w:pPr>
+            <w:r>
+              <w:rPr>
+                <w:rFonts w:ascii="Arial" w:cs="Arial" w:eastAsia="Arial" w:hAnsi="Arial"/>
+                <w:color w:val="555555"/>
+                <w:sz w:val="15"/>
+                <w:szCs w:val="15"/>
               </w:rPr>
               <w:t xml:space="preserve">Courses: </w:t>
             </w:r>
@@ -1344,8 +1657,8 @@
                 <w:rFonts w:ascii="Arial" w:cs="Arial" w:eastAsia="Arial" w:hAnsi="Arial"/>
                 <w:b/>
                 <w:bCs/>
-                <w:sz w:val="17"/>
-                <w:szCs w:val="17"/>
+                <w:sz w:val="15"/>
+                <w:szCs w:val="15"/>
               </w:rPr>
               <w:t xml:space="preserve">13 / 26</w:t>
             </w:r>
@@ -1353,7 +1666,7 @@
         </w:tc>
         <w:tc>
           <w:tcPr>
-            <w:tcW w:type="dxa" w:w="2340"/>
+            <w:tcW w:type="dxa" w:w="1700"/>
             <w:tcBorders>
               <w:top w:val="none" w:color="FFFFFF" w:sz="0"/>
               <w:left w:val="none" w:color="FFFFFF" w:sz="0"/>
@@ -1363,18 +1676,22 @@
             <w:shd w:fill="E8F5E9" w:val="clear"/>
             <w:tcMar>
               <w:top w:type="dxa" w:w="40"/>
-              <w:left w:type="dxa" w:w="80"/>
-              <w:bottom w:type="dxa" w:w="40"/>
-              <w:right w:type="dxa" w:w="80"/>
-            </w:tcMar>
-          </w:tcPr>
-          <w:p>
-            <w:r>
-              <w:rPr>
-                <w:rFonts w:ascii="Arial" w:cs="Arial" w:eastAsia="Arial" w:hAnsi="Arial"/>
-                <w:color w:val="555555"/>
-                <w:sz w:val="17"/>
-                <w:szCs w:val="17"/>
+              <w:left w:type="dxa" w:w="60"/>
+              <w:bottom w:type="dxa" w:w="40"/>
+              <w:right w:type="dxa" w:w="60"/>
+            </w:tcMar>
+            <w:vAlign w:val="center"/>
+          </w:tcPr>
+          <w:p>
+            <w:pPr>
+              <w:jc w:val="center"/>
+            </w:pPr>
+            <w:r>
+              <w:rPr>
+                <w:rFonts w:ascii="Arial" w:cs="Arial" w:eastAsia="Arial" w:hAnsi="Arial"/>
+                <w:color w:val="555555"/>
+                <w:sz w:val="15"/>
+                <w:szCs w:val="15"/>
               </w:rPr>
               <w:t xml:space="preserve">Session: </w:t>
             </w:r>
@@ -1383,8 +1700,8 @@
                 <w:rFonts w:ascii="Arial" w:cs="Arial" w:eastAsia="Arial" w:hAnsi="Arial"/>
                 <w:b/>
                 <w:bCs/>
-                <w:sz w:val="17"/>
-                <w:szCs w:val="17"/>
+                <w:sz w:val="15"/>
+                <w:szCs w:val="15"/>
               </w:rPr>
               <w:t xml:space="preserve">60 min</w:t>
             </w:r>
@@ -1392,7 +1709,7 @@
         </w:tc>
         <w:tc>
           <w:tcPr>
-            <w:tcW w:type="dxa" w:w="2340"/>
+            <w:tcW w:type="dxa" w:w="1700"/>
             <w:tcBorders>
               <w:top w:val="none" w:color="FFFFFF" w:sz="0"/>
               <w:left w:val="none" w:color="FFFFFF" w:sz="0"/>
@@ -1402,18 +1719,22 @@
             <w:shd w:fill="F1EFE8" w:val="clear"/>
             <w:tcMar>
               <w:top w:type="dxa" w:w="40"/>
-              <w:left w:type="dxa" w:w="80"/>
-              <w:bottom w:type="dxa" w:w="40"/>
-              <w:right w:type="dxa" w:w="80"/>
-            </w:tcMar>
-          </w:tcPr>
-          <w:p>
-            <w:r>
-              <w:rPr>
-                <w:rFonts w:ascii="Arial" w:cs="Arial" w:eastAsia="Arial" w:hAnsi="Arial"/>
-                <w:color w:val="555555"/>
-                <w:sz w:val="17"/>
-                <w:szCs w:val="17"/>
+              <w:left w:type="dxa" w:w="60"/>
+              <w:bottom w:type="dxa" w:w="40"/>
+              <w:right w:type="dxa" w:w="60"/>
+            </w:tcMar>
+            <w:vAlign w:val="center"/>
+          </w:tcPr>
+          <w:p>
+            <w:pPr>
+              <w:jc w:val="center"/>
+            </w:pPr>
+            <w:r>
+              <w:rPr>
+                <w:rFonts w:ascii="Arial" w:cs="Arial" w:eastAsia="Arial" w:hAnsi="Arial"/>
+                <w:color w:val="555555"/>
+                <w:sz w:val="15"/>
+                <w:szCs w:val="15"/>
               </w:rPr>
               <w:t xml:space="preserve">BYOB: </w:t>
             </w:r>
@@ -1422,10 +1743,53 @@
                 <w:rFonts w:ascii="Arial" w:cs="Arial" w:eastAsia="Arial" w:hAnsi="Arial"/>
                 <w:b/>
                 <w:bCs/>
-                <w:sz w:val="17"/>
-                <w:szCs w:val="17"/>
-              </w:rPr>
-              <w:t xml:space="preserve">Yes, no corkage</w:t>
+                <w:sz w:val="15"/>
+                <w:szCs w:val="15"/>
+              </w:rPr>
+              <w:t xml:space="preserve">Yes, no fee</w:t>
+            </w:r>
+          </w:p>
+        </w:tc>
+        <w:tc>
+          <w:tcPr>
+            <w:tcW w:type="dxa" w:w="3280"/>
+            <w:tcBorders>
+              <w:top w:val="none" w:color="FFFFFF" w:sz="0"/>
+              <w:left w:val="none" w:color="FFFFFF" w:sz="0"/>
+              <w:bottom w:val="none" w:color="FFFFFF" w:sz="0"/>
+              <w:right w:val="none" w:color="FFFFFF" w:sz="0"/>
+            </w:tcBorders>
+            <w:shd w:fill="F0F0F0" w:val="clear"/>
+            <w:tcMar>
+              <w:top w:type="dxa" w:w="40"/>
+              <w:left w:type="dxa" w:w="60"/>
+              <w:bottom w:type="dxa" w:w="40"/>
+              <w:right w:type="dxa" w:w="60"/>
+            </w:tcMar>
+            <w:vAlign w:val="center"/>
+          </w:tcPr>
+          <w:p>
+            <w:pPr>
+              <w:jc w:val="center"/>
+            </w:pPr>
+            <w:r>
+              <w:rPr>
+                <w:rFonts w:ascii="Arial" w:cs="Arial" w:eastAsia="Arial" w:hAnsi="Arial"/>
+                <w:color w:val="555555"/>
+                <w:sz w:val="15"/>
+                <w:szCs w:val="15"/>
+              </w:rPr>
+              <w:t xml:space="preserve">G / Y: </w:t>
+            </w:r>
+            <w:r>
+              <w:rPr>
+                <w:rFonts w:ascii="Arial" w:cs="Arial" w:eastAsia="Arial" w:hAnsi="Arial"/>
+                <w:b/>
+                <w:bCs/>
+                <w:sz w:val="15"/>
+                <w:szCs w:val="15"/>
+              </w:rPr>
+              <w:t xml:space="preserve">4.9 (967) / 4.7 (146)</w:t>
             </w:r>
           </w:p>
         </w:tc>
@@ -1434,6 +1798,7 @@
     <w:p>
       <w:pPr>
         <w:spacing w:after="0" w:before="60"/>
+        <w:jc w:val="left"/>
       </w:pPr>
       <w:r>
         <w:rPr>
@@ -1441,13 +1806,13 @@
           <w:sz w:val="19"/>
           <w:szCs w:val="19"/>
         </w:rPr>
-        <w:t xml:space="preserve">Best value play: $69 gets 13. Can double to 26 for $138. Shinzo Special add-on +$25. BYOB with no corkage fee. 5 seatings per night. Great for a big appetite, bring your own sake night.</w:t>
+        <w:t xml:space="preserve">Best value play: $69 gets 13. Can double to 26 for $138. Shinzo Special add-on +$25. BYOB with no fee. 5 seatings per night. Great for a big appetite, bring your own sake night.</w:t>
       </w:r>
     </w:p>
     <w:p>
       <w:pPr>
         <w:tabs>
-          <w:tab w:val="center" w:pos="5100"/>
+          <w:tab w:val="center" w:pos="5040"/>
         </w:tabs>
         <w:spacing w:after="30" w:before="200"/>
       </w:pPr>
@@ -1491,7 +1856,7 @@
     </w:p>
     <w:tbl>
       <w:tblPr>
-        <w:tblW w:type="dxa" w:w="9360"/>
+        <w:tblW w:type="dxa" w:w="10080"/>
         <w:tblBorders>
           <w:top w:val="single" w:color="auto" w:sz="4"/>
           <w:left w:val="single" w:color="auto" w:sz="4"/>
@@ -1502,15 +1867,16 @@
         </w:tblBorders>
       </w:tblPr>
       <w:tblGrid>
-        <w:gridCol w:w="2340"/>
-        <w:gridCol w:w="2340"/>
-        <w:gridCol w:w="2340"/>
-        <w:gridCol w:w="2340"/>
+        <w:gridCol w:w="1800"/>
+        <w:gridCol w:w="1600"/>
+        <w:gridCol w:w="1700"/>
+        <w:gridCol w:w="1700"/>
+        <w:gridCol w:w="3280"/>
       </w:tblGrid>
       <w:tr>
         <w:tc>
           <w:tcPr>
-            <w:tcW w:type="dxa" w:w="2340"/>
+            <w:tcW w:type="dxa" w:w="1800"/>
             <w:tcBorders>
               <w:top w:val="none" w:color="FFFFFF" w:sz="0"/>
               <w:left w:val="none" w:color="FFFFFF" w:sz="0"/>
@@ -1520,18 +1886,22 @@
             <w:shd w:fill="E6F1FB" w:val="clear"/>
             <w:tcMar>
               <w:top w:type="dxa" w:w="40"/>
-              <w:left w:type="dxa" w:w="80"/>
-              <w:bottom w:type="dxa" w:w="40"/>
-              <w:right w:type="dxa" w:w="80"/>
-            </w:tcMar>
-          </w:tcPr>
-          <w:p>
-            <w:r>
-              <w:rPr>
-                <w:rFonts w:ascii="Arial" w:cs="Arial" w:eastAsia="Arial" w:hAnsi="Arial"/>
-                <w:color w:val="555555"/>
-                <w:sz w:val="17"/>
-                <w:szCs w:val="17"/>
+              <w:left w:type="dxa" w:w="60"/>
+              <w:bottom w:type="dxa" w:w="40"/>
+              <w:right w:type="dxa" w:w="60"/>
+            </w:tcMar>
+            <w:vAlign w:val="center"/>
+          </w:tcPr>
+          <w:p>
+            <w:pPr>
+              <w:jc w:val="center"/>
+            </w:pPr>
+            <w:r>
+              <w:rPr>
+                <w:rFonts w:ascii="Arial" w:cs="Arial" w:eastAsia="Arial" w:hAnsi="Arial"/>
+                <w:color w:val="555555"/>
+                <w:sz w:val="15"/>
+                <w:szCs w:val="15"/>
               </w:rPr>
               <w:t xml:space="preserve">Price: </w:t>
             </w:r>
@@ -1540,8 +1910,8 @@
                 <w:rFonts w:ascii="Arial" w:cs="Arial" w:eastAsia="Arial" w:hAnsi="Arial"/>
                 <w:b/>
                 <w:bCs/>
-                <w:sz w:val="17"/>
-                <w:szCs w:val="17"/>
+                <w:sz w:val="15"/>
+                <w:szCs w:val="15"/>
               </w:rPr>
               <w:t xml:space="preserve">$99</w:t>
             </w:r>
@@ -1549,7 +1919,7 @@
         </w:tc>
         <w:tc>
           <w:tcPr>
-            <w:tcW w:type="dxa" w:w="2340"/>
+            <w:tcW w:type="dxa" w:w="1600"/>
             <w:tcBorders>
               <w:top w:val="none" w:color="FFFFFF" w:sz="0"/>
               <w:left w:val="none" w:color="FFFFFF" w:sz="0"/>
@@ -1559,18 +1929,22 @@
             <w:shd w:fill="E6F1FB" w:val="clear"/>
             <w:tcMar>
               <w:top w:type="dxa" w:w="40"/>
-              <w:left w:type="dxa" w:w="80"/>
-              <w:bottom w:type="dxa" w:w="40"/>
-              <w:right w:type="dxa" w:w="80"/>
-            </w:tcMar>
-          </w:tcPr>
-          <w:p>
-            <w:r>
-              <w:rPr>
-                <w:rFonts w:ascii="Arial" w:cs="Arial" w:eastAsia="Arial" w:hAnsi="Arial"/>
-                <w:color w:val="555555"/>
-                <w:sz w:val="17"/>
-                <w:szCs w:val="17"/>
+              <w:left w:type="dxa" w:w="60"/>
+              <w:bottom w:type="dxa" w:w="40"/>
+              <w:right w:type="dxa" w:w="60"/>
+            </w:tcMar>
+            <w:vAlign w:val="center"/>
+          </w:tcPr>
+          <w:p>
+            <w:pPr>
+              <w:jc w:val="center"/>
+            </w:pPr>
+            <w:r>
+              <w:rPr>
+                <w:rFonts w:ascii="Arial" w:cs="Arial" w:eastAsia="Arial" w:hAnsi="Arial"/>
+                <w:color w:val="555555"/>
+                <w:sz w:val="15"/>
+                <w:szCs w:val="15"/>
               </w:rPr>
               <w:t xml:space="preserve">Courses: </w:t>
             </w:r>
@@ -1579,8 +1953,8 @@
                 <w:rFonts w:ascii="Arial" w:cs="Arial" w:eastAsia="Arial" w:hAnsi="Arial"/>
                 <w:b/>
                 <w:bCs/>
-                <w:sz w:val="17"/>
-                <w:szCs w:val="17"/>
+                <w:sz w:val="15"/>
+                <w:szCs w:val="15"/>
               </w:rPr>
               <w:t xml:space="preserve">16</w:t>
             </w:r>
@@ -1588,7 +1962,7 @@
         </w:tc>
         <w:tc>
           <w:tcPr>
-            <w:tcW w:type="dxa" w:w="2340"/>
+            <w:tcW w:type="dxa" w:w="1700"/>
             <w:tcBorders>
               <w:top w:val="none" w:color="FFFFFF" w:sz="0"/>
               <w:left w:val="none" w:color="FFFFFF" w:sz="0"/>
@@ -1598,18 +1972,22 @@
             <w:shd w:fill="E8F5E9" w:val="clear"/>
             <w:tcMar>
               <w:top w:type="dxa" w:w="40"/>
-              <w:left w:type="dxa" w:w="80"/>
-              <w:bottom w:type="dxa" w:w="40"/>
-              <w:right w:type="dxa" w:w="80"/>
-            </w:tcMar>
-          </w:tcPr>
-          <w:p>
-            <w:r>
-              <w:rPr>
-                <w:rFonts w:ascii="Arial" w:cs="Arial" w:eastAsia="Arial" w:hAnsi="Arial"/>
-                <w:color w:val="555555"/>
-                <w:sz w:val="17"/>
-                <w:szCs w:val="17"/>
+              <w:left w:type="dxa" w:w="60"/>
+              <w:bottom w:type="dxa" w:w="40"/>
+              <w:right w:type="dxa" w:w="60"/>
+            </w:tcMar>
+            <w:vAlign w:val="center"/>
+          </w:tcPr>
+          <w:p>
+            <w:pPr>
+              <w:jc w:val="center"/>
+            </w:pPr>
+            <w:r>
+              <w:rPr>
+                <w:rFonts w:ascii="Arial" w:cs="Arial" w:eastAsia="Arial" w:hAnsi="Arial"/>
+                <w:color w:val="555555"/>
+                <w:sz w:val="15"/>
+                <w:szCs w:val="15"/>
               </w:rPr>
               <w:t xml:space="preserve">Session: </w:t>
             </w:r>
@@ -1618,8 +1996,8 @@
                 <w:rFonts w:ascii="Arial" w:cs="Arial" w:eastAsia="Arial" w:hAnsi="Arial"/>
                 <w:b/>
                 <w:bCs/>
-                <w:sz w:val="17"/>
-                <w:szCs w:val="17"/>
+                <w:sz w:val="15"/>
+                <w:szCs w:val="15"/>
               </w:rPr>
               <w:t xml:space="preserve">90 min</w:t>
             </w:r>
@@ -1627,7 +2005,7 @@
         </w:tc>
         <w:tc>
           <w:tcPr>
-            <w:tcW w:type="dxa" w:w="2340"/>
+            <w:tcW w:type="dxa" w:w="1700"/>
             <w:tcBorders>
               <w:top w:val="none" w:color="FFFFFF" w:sz="0"/>
               <w:left w:val="none" w:color="FFFFFF" w:sz="0"/>
@@ -1637,18 +2015,22 @@
             <w:shd w:fill="F1EFE8" w:val="clear"/>
             <w:tcMar>
               <w:top w:type="dxa" w:w="40"/>
-              <w:left w:type="dxa" w:w="80"/>
-              <w:bottom w:type="dxa" w:w="40"/>
-              <w:right w:type="dxa" w:w="80"/>
-            </w:tcMar>
-          </w:tcPr>
-          <w:p>
-            <w:r>
-              <w:rPr>
-                <w:rFonts w:ascii="Arial" w:cs="Arial" w:eastAsia="Arial" w:hAnsi="Arial"/>
-                <w:color w:val="555555"/>
-                <w:sz w:val="17"/>
-                <w:szCs w:val="17"/>
+              <w:left w:type="dxa" w:w="60"/>
+              <w:bottom w:type="dxa" w:w="40"/>
+              <w:right w:type="dxa" w:w="60"/>
+            </w:tcMar>
+            <w:vAlign w:val="center"/>
+          </w:tcPr>
+          <w:p>
+            <w:pPr>
+              <w:jc w:val="center"/>
+            </w:pPr>
+            <w:r>
+              <w:rPr>
+                <w:rFonts w:ascii="Arial" w:cs="Arial" w:eastAsia="Arial" w:hAnsi="Arial"/>
+                <w:color w:val="555555"/>
+                <w:sz w:val="15"/>
+                <w:szCs w:val="15"/>
               </w:rPr>
               <w:t xml:space="preserve">BYOB: </w:t>
             </w:r>
@@ -1657,10 +2039,53 @@
                 <w:rFonts w:ascii="Arial" w:cs="Arial" w:eastAsia="Arial" w:hAnsi="Arial"/>
                 <w:b/>
                 <w:bCs/>
-                <w:sz w:val="17"/>
-                <w:szCs w:val="17"/>
+                <w:sz w:val="15"/>
+                <w:szCs w:val="15"/>
               </w:rPr>
               <w:t xml:space="preserve">Yes</w:t>
+            </w:r>
+          </w:p>
+        </w:tc>
+        <w:tc>
+          <w:tcPr>
+            <w:tcW w:type="dxa" w:w="3280"/>
+            <w:tcBorders>
+              <w:top w:val="none" w:color="FFFFFF" w:sz="0"/>
+              <w:left w:val="none" w:color="FFFFFF" w:sz="0"/>
+              <w:bottom w:val="none" w:color="FFFFFF" w:sz="0"/>
+              <w:right w:val="none" w:color="FFFFFF" w:sz="0"/>
+            </w:tcBorders>
+            <w:shd w:fill="F0F0F0" w:val="clear"/>
+            <w:tcMar>
+              <w:top w:type="dxa" w:w="40"/>
+              <w:left w:type="dxa" w:w="60"/>
+              <w:bottom w:type="dxa" w:w="40"/>
+              <w:right w:type="dxa" w:w="60"/>
+            </w:tcMar>
+            <w:vAlign w:val="center"/>
+          </w:tcPr>
+          <w:p>
+            <w:pPr>
+              <w:jc w:val="center"/>
+            </w:pPr>
+            <w:r>
+              <w:rPr>
+                <w:rFonts w:ascii="Arial" w:cs="Arial" w:eastAsia="Arial" w:hAnsi="Arial"/>
+                <w:color w:val="555555"/>
+                <w:sz w:val="15"/>
+                <w:szCs w:val="15"/>
+              </w:rPr>
+              <w:t xml:space="preserve">G / Y: </w:t>
+            </w:r>
+            <w:r>
+              <w:rPr>
+                <w:rFonts w:ascii="Arial" w:cs="Arial" w:eastAsia="Arial" w:hAnsi="Arial"/>
+                <w:b/>
+                <w:bCs/>
+                <w:sz w:val="15"/>
+                <w:szCs w:val="15"/>
+              </w:rPr>
+              <w:t xml:space="preserve">4.9 (238) / 4.8 (42)</w:t>
             </w:r>
           </w:p>
         </w:tc>
@@ -1669,6 +2094,7 @@
     <w:p>
       <w:pPr>
         <w:spacing w:after="0" w:before="60"/>
+        <w:jc w:val="left"/>
       </w:pPr>
       <w:r>
         <w:rPr>
@@ -1682,7 +2108,7 @@
     <w:p>
       <w:pPr>
         <w:tabs>
-          <w:tab w:val="center" w:pos="5100"/>
+          <w:tab w:val="center" w:pos="5040"/>
         </w:tabs>
         <w:spacing w:after="30" w:before="200"/>
       </w:pPr>
@@ -1726,7 +2152,7 @@
     </w:p>
     <w:tbl>
       <w:tblPr>
-        <w:tblW w:type="dxa" w:w="9360"/>
+        <w:tblW w:type="dxa" w:w="10080"/>
         <w:tblBorders>
           <w:top w:val="single" w:color="auto" w:sz="4"/>
           <w:left w:val="single" w:color="auto" w:sz="4"/>
@@ -1737,15 +2163,16 @@
         </w:tblBorders>
       </w:tblPr>
       <w:tblGrid>
-        <w:gridCol w:w="2340"/>
-        <w:gridCol w:w="2340"/>
-        <w:gridCol w:w="2340"/>
-        <w:gridCol w:w="2340"/>
+        <w:gridCol w:w="1800"/>
+        <w:gridCol w:w="1600"/>
+        <w:gridCol w:w="1700"/>
+        <w:gridCol w:w="1700"/>
+        <w:gridCol w:w="3280"/>
       </w:tblGrid>
       <w:tr>
         <w:tc>
           <w:tcPr>
-            <w:tcW w:type="dxa" w:w="2340"/>
+            <w:tcW w:type="dxa" w:w="1800"/>
             <w:tcBorders>
               <w:top w:val="none" w:color="FFFFFF" w:sz="0"/>
               <w:left w:val="none" w:color="FFFFFF" w:sz="0"/>
@@ -1755,18 +2182,22 @@
             <w:shd w:fill="E6F1FB" w:val="clear"/>
             <w:tcMar>
               <w:top w:type="dxa" w:w="40"/>
-              <w:left w:type="dxa" w:w="80"/>
-              <w:bottom w:type="dxa" w:w="40"/>
-              <w:right w:type="dxa" w:w="80"/>
-            </w:tcMar>
-          </w:tcPr>
-          <w:p>
-            <w:r>
-              <w:rPr>
-                <w:rFonts w:ascii="Arial" w:cs="Arial" w:eastAsia="Arial" w:hAnsi="Arial"/>
-                <w:color w:val="555555"/>
-                <w:sz w:val="17"/>
-                <w:szCs w:val="17"/>
+              <w:left w:type="dxa" w:w="60"/>
+              <w:bottom w:type="dxa" w:w="40"/>
+              <w:right w:type="dxa" w:w="60"/>
+            </w:tcMar>
+            <w:vAlign w:val="center"/>
+          </w:tcPr>
+          <w:p>
+            <w:pPr>
+              <w:jc w:val="center"/>
+            </w:pPr>
+            <w:r>
+              <w:rPr>
+                <w:rFonts w:ascii="Arial" w:cs="Arial" w:eastAsia="Arial" w:hAnsi="Arial"/>
+                <w:color w:val="555555"/>
+                <w:sz w:val="15"/>
+                <w:szCs w:val="15"/>
               </w:rPr>
               <w:t xml:space="preserve">Price: </w:t>
             </w:r>
@@ -1775,8 +2206,8 @@
                 <w:rFonts w:ascii="Arial" w:cs="Arial" w:eastAsia="Arial" w:hAnsi="Arial"/>
                 <w:b/>
                 <w:bCs/>
-                <w:sz w:val="17"/>
-                <w:szCs w:val="17"/>
+                <w:sz w:val="15"/>
+                <w:szCs w:val="15"/>
               </w:rPr>
               <w:t xml:space="preserve">$85 / $105 / $125</w:t>
             </w:r>
@@ -1784,7 +2215,7 @@
         </w:tc>
         <w:tc>
           <w:tcPr>
-            <w:tcW w:type="dxa" w:w="2340"/>
+            <w:tcW w:type="dxa" w:w="1600"/>
             <w:tcBorders>
               <w:top w:val="none" w:color="FFFFFF" w:sz="0"/>
               <w:left w:val="none" w:color="FFFFFF" w:sz="0"/>
@@ -1794,18 +2225,22 @@
             <w:shd w:fill="E6F1FB" w:val="clear"/>
             <w:tcMar>
               <w:top w:type="dxa" w:w="40"/>
-              <w:left w:type="dxa" w:w="80"/>
-              <w:bottom w:type="dxa" w:w="40"/>
-              <w:right w:type="dxa" w:w="80"/>
-            </w:tcMar>
-          </w:tcPr>
-          <w:p>
-            <w:r>
-              <w:rPr>
-                <w:rFonts w:ascii="Arial" w:cs="Arial" w:eastAsia="Arial" w:hAnsi="Arial"/>
-                <w:color w:val="555555"/>
-                <w:sz w:val="17"/>
-                <w:szCs w:val="17"/>
+              <w:left w:type="dxa" w:w="60"/>
+              <w:bottom w:type="dxa" w:w="40"/>
+              <w:right w:type="dxa" w:w="60"/>
+            </w:tcMar>
+            <w:vAlign w:val="center"/>
+          </w:tcPr>
+          <w:p>
+            <w:pPr>
+              <w:jc w:val="center"/>
+            </w:pPr>
+            <w:r>
+              <w:rPr>
+                <w:rFonts w:ascii="Arial" w:cs="Arial" w:eastAsia="Arial" w:hAnsi="Arial"/>
+                <w:color w:val="555555"/>
+                <w:sz w:val="15"/>
+                <w:szCs w:val="15"/>
               </w:rPr>
               <w:t xml:space="preserve">Courses: </w:t>
             </w:r>
@@ -1814,8 +2249,8 @@
                 <w:rFonts w:ascii="Arial" w:cs="Arial" w:eastAsia="Arial" w:hAnsi="Arial"/>
                 <w:b/>
                 <w:bCs/>
-                <w:sz w:val="17"/>
-                <w:szCs w:val="17"/>
+                <w:sz w:val="15"/>
+                <w:szCs w:val="15"/>
               </w:rPr>
               <w:t xml:space="preserve">~14 / ~16 / 18</w:t>
             </w:r>
@@ -1823,7 +2258,7 @@
         </w:tc>
         <w:tc>
           <w:tcPr>
-            <w:tcW w:type="dxa" w:w="2340"/>
+            <w:tcW w:type="dxa" w:w="1700"/>
             <w:tcBorders>
               <w:top w:val="none" w:color="FFFFFF" w:sz="0"/>
               <w:left w:val="none" w:color="FFFFFF" w:sz="0"/>
@@ -1833,18 +2268,22 @@
             <w:shd w:fill="E8F5E9" w:val="clear"/>
             <w:tcMar>
               <w:top w:type="dxa" w:w="40"/>
-              <w:left w:type="dxa" w:w="80"/>
-              <w:bottom w:type="dxa" w:w="40"/>
-              <w:right w:type="dxa" w:w="80"/>
-            </w:tcMar>
-          </w:tcPr>
-          <w:p>
-            <w:r>
-              <w:rPr>
-                <w:rFonts w:ascii="Arial" w:cs="Arial" w:eastAsia="Arial" w:hAnsi="Arial"/>
-                <w:color w:val="555555"/>
-                <w:sz w:val="17"/>
-                <w:szCs w:val="17"/>
+              <w:left w:type="dxa" w:w="60"/>
+              <w:bottom w:type="dxa" w:w="40"/>
+              <w:right w:type="dxa" w:w="60"/>
+            </w:tcMar>
+            <w:vAlign w:val="center"/>
+          </w:tcPr>
+          <w:p>
+            <w:pPr>
+              <w:jc w:val="center"/>
+            </w:pPr>
+            <w:r>
+              <w:rPr>
+                <w:rFonts w:ascii="Arial" w:cs="Arial" w:eastAsia="Arial" w:hAnsi="Arial"/>
+                <w:color w:val="555555"/>
+                <w:sz w:val="15"/>
+                <w:szCs w:val="15"/>
               </w:rPr>
               <w:t xml:space="preserve">Session: </w:t>
             </w:r>
@@ -1853,8 +2292,8 @@
                 <w:rFonts w:ascii="Arial" w:cs="Arial" w:eastAsia="Arial" w:hAnsi="Arial"/>
                 <w:b/>
                 <w:bCs/>
-                <w:sz w:val="17"/>
-                <w:szCs w:val="17"/>
+                <w:sz w:val="15"/>
+                <w:szCs w:val="15"/>
               </w:rPr>
               <w:t xml:space="preserve">~105 min</w:t>
             </w:r>
@@ -1862,7 +2301,7 @@
         </w:tc>
         <w:tc>
           <w:tcPr>
-            <w:tcW w:type="dxa" w:w="2340"/>
+            <w:tcW w:type="dxa" w:w="1700"/>
             <w:tcBorders>
               <w:top w:val="none" w:color="FFFFFF" w:sz="0"/>
               <w:left w:val="none" w:color="FFFFFF" w:sz="0"/>
@@ -1872,18 +2311,22 @@
             <w:shd w:fill="F1EFE8" w:val="clear"/>
             <w:tcMar>
               <w:top w:type="dxa" w:w="40"/>
-              <w:left w:type="dxa" w:w="80"/>
-              <w:bottom w:type="dxa" w:w="40"/>
-              <w:right w:type="dxa" w:w="80"/>
-            </w:tcMar>
-          </w:tcPr>
-          <w:p>
-            <w:r>
-              <w:rPr>
-                <w:rFonts w:ascii="Arial" w:cs="Arial" w:eastAsia="Arial" w:hAnsi="Arial"/>
-                <w:color w:val="555555"/>
-                <w:sz w:val="17"/>
-                <w:szCs w:val="17"/>
+              <w:left w:type="dxa" w:w="60"/>
+              <w:bottom w:type="dxa" w:w="40"/>
+              <w:right w:type="dxa" w:w="60"/>
+            </w:tcMar>
+            <w:vAlign w:val="center"/>
+          </w:tcPr>
+          <w:p>
+            <w:pPr>
+              <w:jc w:val="center"/>
+            </w:pPr>
+            <w:r>
+              <w:rPr>
+                <w:rFonts w:ascii="Arial" w:cs="Arial" w:eastAsia="Arial" w:hAnsi="Arial"/>
+                <w:color w:val="555555"/>
+                <w:sz w:val="15"/>
+                <w:szCs w:val="15"/>
               </w:rPr>
               <w:t xml:space="preserve">BYOB: </w:t>
             </w:r>
@@ -1892,10 +2335,53 @@
                 <w:rFonts w:ascii="Arial" w:cs="Arial" w:eastAsia="Arial" w:hAnsi="Arial"/>
                 <w:b w:val="false"/>
                 <w:bCs w:val="false"/>
-                <w:sz w:val="17"/>
-                <w:szCs w:val="17"/>
+                <w:sz w:val="15"/>
+                <w:szCs w:val="15"/>
               </w:rPr>
               <w:t xml:space="preserve">No</w:t>
+            </w:r>
+          </w:p>
+        </w:tc>
+        <w:tc>
+          <w:tcPr>
+            <w:tcW w:type="dxa" w:w="3280"/>
+            <w:tcBorders>
+              <w:top w:val="none" w:color="FFFFFF" w:sz="0"/>
+              <w:left w:val="none" w:color="FFFFFF" w:sz="0"/>
+              <w:bottom w:val="none" w:color="FFFFFF" w:sz="0"/>
+              <w:right w:val="none" w:color="FFFFFF" w:sz="0"/>
+            </w:tcBorders>
+            <w:shd w:fill="F0F0F0" w:val="clear"/>
+            <w:tcMar>
+              <w:top w:type="dxa" w:w="40"/>
+              <w:left w:type="dxa" w:w="60"/>
+              <w:bottom w:type="dxa" w:w="40"/>
+              <w:right w:type="dxa" w:w="60"/>
+            </w:tcMar>
+            <w:vAlign w:val="center"/>
+          </w:tcPr>
+          <w:p>
+            <w:pPr>
+              <w:jc w:val="center"/>
+            </w:pPr>
+            <w:r>
+              <w:rPr>
+                <w:rFonts w:ascii="Arial" w:cs="Arial" w:eastAsia="Arial" w:hAnsi="Arial"/>
+                <w:color w:val="555555"/>
+                <w:sz w:val="15"/>
+                <w:szCs w:val="15"/>
+              </w:rPr>
+              <w:t xml:space="preserve">G / Y: </w:t>
+            </w:r>
+            <w:r>
+              <w:rPr>
+                <w:rFonts w:ascii="Arial" w:cs="Arial" w:eastAsia="Arial" w:hAnsi="Arial"/>
+                <w:b/>
+                <w:bCs/>
+                <w:sz w:val="15"/>
+                <w:szCs w:val="15"/>
+              </w:rPr>
+              <w:t xml:space="preserve">4.8 (214) / 4.7 (73)</w:t>
             </w:r>
           </w:p>
         </w:tc>
@@ -1904,6 +2390,7 @@
     <w:p>
       <w:pPr>
         <w:spacing w:after="0" w:before="60"/>
+        <w:jc w:val="left"/>
       </w:pPr>
       <w:r>
         <w:rPr>
@@ -1917,7 +2404,7 @@
     <w:p>
       <w:pPr>
         <w:tabs>
-          <w:tab w:val="center" w:pos="5100"/>
+          <w:tab w:val="center" w:pos="5040"/>
         </w:tabs>
         <w:spacing w:after="30" w:before="200"/>
       </w:pPr>
@@ -1961,7 +2448,7 @@
     </w:p>
     <w:tbl>
       <w:tblPr>
-        <w:tblW w:type="dxa" w:w="9360"/>
+        <w:tblW w:type="dxa" w:w="10080"/>
         <w:tblBorders>
           <w:top w:val="single" w:color="auto" w:sz="4"/>
           <w:left w:val="single" w:color="auto" w:sz="4"/>
@@ -1972,15 +2459,16 @@
         </w:tblBorders>
       </w:tblPr>
       <w:tblGrid>
-        <w:gridCol w:w="2340"/>
-        <w:gridCol w:w="2340"/>
-        <w:gridCol w:w="2340"/>
-        <w:gridCol w:w="2340"/>
+        <w:gridCol w:w="1800"/>
+        <w:gridCol w:w="1600"/>
+        <w:gridCol w:w="1700"/>
+        <w:gridCol w:w="1700"/>
+        <w:gridCol w:w="3280"/>
       </w:tblGrid>
       <w:tr>
         <w:tc>
           <w:tcPr>
-            <w:tcW w:type="dxa" w:w="2340"/>
+            <w:tcW w:type="dxa" w:w="1800"/>
             <w:tcBorders>
               <w:top w:val="none" w:color="FFFFFF" w:sz="0"/>
               <w:left w:val="none" w:color="FFFFFF" w:sz="0"/>
@@ -1990,18 +2478,22 @@
             <w:shd w:fill="E6F1FB" w:val="clear"/>
             <w:tcMar>
               <w:top w:type="dxa" w:w="40"/>
-              <w:left w:type="dxa" w:w="80"/>
-              <w:bottom w:type="dxa" w:w="40"/>
-              <w:right w:type="dxa" w:w="80"/>
-            </w:tcMar>
-          </w:tcPr>
-          <w:p>
-            <w:r>
-              <w:rPr>
-                <w:rFonts w:ascii="Arial" w:cs="Arial" w:eastAsia="Arial" w:hAnsi="Arial"/>
-                <w:color w:val="555555"/>
-                <w:sz w:val="17"/>
-                <w:szCs w:val="17"/>
+              <w:left w:type="dxa" w:w="60"/>
+              <w:bottom w:type="dxa" w:w="40"/>
+              <w:right w:type="dxa" w:w="60"/>
+            </w:tcMar>
+            <w:vAlign w:val="center"/>
+          </w:tcPr>
+          <w:p>
+            <w:pPr>
+              <w:jc w:val="center"/>
+            </w:pPr>
+            <w:r>
+              <w:rPr>
+                <w:rFonts w:ascii="Arial" w:cs="Arial" w:eastAsia="Arial" w:hAnsi="Arial"/>
+                <w:color w:val="555555"/>
+                <w:sz w:val="15"/>
+                <w:szCs w:val="15"/>
               </w:rPr>
               <w:t xml:space="preserve">Price: </w:t>
             </w:r>
@@ -2010,8 +2502,8 @@
                 <w:rFonts w:ascii="Arial" w:cs="Arial" w:eastAsia="Arial" w:hAnsi="Arial"/>
                 <w:b/>
                 <w:bCs/>
-                <w:sz w:val="17"/>
-                <w:szCs w:val="17"/>
+                <w:sz w:val="15"/>
+                <w:szCs w:val="15"/>
               </w:rPr>
               <w:t xml:space="preserve">$69 / $100</w:t>
             </w:r>
@@ -2019,7 +2511,7 @@
         </w:tc>
         <w:tc>
           <w:tcPr>
-            <w:tcW w:type="dxa" w:w="2340"/>
+            <w:tcW w:type="dxa" w:w="1600"/>
             <w:tcBorders>
               <w:top w:val="none" w:color="FFFFFF" w:sz="0"/>
               <w:left w:val="none" w:color="FFFFFF" w:sz="0"/>
@@ -2029,18 +2521,22 @@
             <w:shd w:fill="E6F1FB" w:val="clear"/>
             <w:tcMar>
               <w:top w:type="dxa" w:w="40"/>
-              <w:left w:type="dxa" w:w="80"/>
-              <w:bottom w:type="dxa" w:w="40"/>
-              <w:right w:type="dxa" w:w="80"/>
-            </w:tcMar>
-          </w:tcPr>
-          <w:p>
-            <w:r>
-              <w:rPr>
-                <w:rFonts w:ascii="Arial" w:cs="Arial" w:eastAsia="Arial" w:hAnsi="Arial"/>
-                <w:color w:val="555555"/>
-                <w:sz w:val="17"/>
-                <w:szCs w:val="17"/>
+              <w:left w:type="dxa" w:w="60"/>
+              <w:bottom w:type="dxa" w:w="40"/>
+              <w:right w:type="dxa" w:w="60"/>
+            </w:tcMar>
+            <w:vAlign w:val="center"/>
+          </w:tcPr>
+          <w:p>
+            <w:pPr>
+              <w:jc w:val="center"/>
+            </w:pPr>
+            <w:r>
+              <w:rPr>
+                <w:rFonts w:ascii="Arial" w:cs="Arial" w:eastAsia="Arial" w:hAnsi="Arial"/>
+                <w:color w:val="555555"/>
+                <w:sz w:val="15"/>
+                <w:szCs w:val="15"/>
               </w:rPr>
               <w:t xml:space="preserve">Courses: </w:t>
             </w:r>
@@ -2049,8 +2545,8 @@
                 <w:rFonts w:ascii="Arial" w:cs="Arial" w:eastAsia="Arial" w:hAnsi="Arial"/>
                 <w:b/>
                 <w:bCs/>
-                <w:sz w:val="17"/>
-                <w:szCs w:val="17"/>
+                <w:sz w:val="15"/>
+                <w:szCs w:val="15"/>
               </w:rPr>
               <w:t xml:space="preserve">12 / 16</w:t>
             </w:r>
@@ -2058,7 +2554,7 @@
         </w:tc>
         <w:tc>
           <w:tcPr>
-            <w:tcW w:type="dxa" w:w="2340"/>
+            <w:tcW w:type="dxa" w:w="1700"/>
             <w:tcBorders>
               <w:top w:val="none" w:color="FFFFFF" w:sz="0"/>
               <w:left w:val="none" w:color="FFFFFF" w:sz="0"/>
@@ -2068,18 +2564,22 @@
             <w:shd w:fill="E8F5E9" w:val="clear"/>
             <w:tcMar>
               <w:top w:type="dxa" w:w="40"/>
-              <w:left w:type="dxa" w:w="80"/>
-              <w:bottom w:type="dxa" w:w="40"/>
-              <w:right w:type="dxa" w:w="80"/>
-            </w:tcMar>
-          </w:tcPr>
-          <w:p>
-            <w:r>
-              <w:rPr>
-                <w:rFonts w:ascii="Arial" w:cs="Arial" w:eastAsia="Arial" w:hAnsi="Arial"/>
-                <w:color w:val="555555"/>
-                <w:sz w:val="17"/>
-                <w:szCs w:val="17"/>
+              <w:left w:type="dxa" w:w="60"/>
+              <w:bottom w:type="dxa" w:w="40"/>
+              <w:right w:type="dxa" w:w="60"/>
+            </w:tcMar>
+            <w:vAlign w:val="center"/>
+          </w:tcPr>
+          <w:p>
+            <w:pPr>
+              <w:jc w:val="center"/>
+            </w:pPr>
+            <w:r>
+              <w:rPr>
+                <w:rFonts w:ascii="Arial" w:cs="Arial" w:eastAsia="Arial" w:hAnsi="Arial"/>
+                <w:color w:val="555555"/>
+                <w:sz w:val="15"/>
+                <w:szCs w:val="15"/>
               </w:rPr>
               <w:t xml:space="preserve">Session: </w:t>
             </w:r>
@@ -2088,8 +2588,8 @@
                 <w:rFonts w:ascii="Arial" w:cs="Arial" w:eastAsia="Arial" w:hAnsi="Arial"/>
                 <w:b/>
                 <w:bCs/>
-                <w:sz w:val="17"/>
-                <w:szCs w:val="17"/>
+                <w:sz w:val="15"/>
+                <w:szCs w:val="15"/>
               </w:rPr>
               <w:t xml:space="preserve">60-75 min</w:t>
             </w:r>
@@ -2097,7 +2597,7 @@
         </w:tc>
         <w:tc>
           <w:tcPr>
-            <w:tcW w:type="dxa" w:w="2340"/>
+            <w:tcW w:type="dxa" w:w="1700"/>
             <w:tcBorders>
               <w:top w:val="none" w:color="FFFFFF" w:sz="0"/>
               <w:left w:val="none" w:color="FFFFFF" w:sz="0"/>
@@ -2107,18 +2607,22 @@
             <w:shd w:fill="F1EFE8" w:val="clear"/>
             <w:tcMar>
               <w:top w:type="dxa" w:w="40"/>
-              <w:left w:type="dxa" w:w="80"/>
-              <w:bottom w:type="dxa" w:w="40"/>
-              <w:right w:type="dxa" w:w="80"/>
-            </w:tcMar>
-          </w:tcPr>
-          <w:p>
-            <w:r>
-              <w:rPr>
-                <w:rFonts w:ascii="Arial" w:cs="Arial" w:eastAsia="Arial" w:hAnsi="Arial"/>
-                <w:color w:val="555555"/>
-                <w:sz w:val="17"/>
-                <w:szCs w:val="17"/>
+              <w:left w:type="dxa" w:w="60"/>
+              <w:bottom w:type="dxa" w:w="40"/>
+              <w:right w:type="dxa" w:w="60"/>
+            </w:tcMar>
+            <w:vAlign w:val="center"/>
+          </w:tcPr>
+          <w:p>
+            <w:pPr>
+              <w:jc w:val="center"/>
+            </w:pPr>
+            <w:r>
+              <w:rPr>
+                <w:rFonts w:ascii="Arial" w:cs="Arial" w:eastAsia="Arial" w:hAnsi="Arial"/>
+                <w:color w:val="555555"/>
+                <w:sz w:val="15"/>
+                <w:szCs w:val="15"/>
               </w:rPr>
               <w:t xml:space="preserve">BYOB: </w:t>
             </w:r>
@@ -2127,10 +2631,53 @@
                 <w:rFonts w:ascii="Arial" w:cs="Arial" w:eastAsia="Arial" w:hAnsi="Arial"/>
                 <w:b w:val="false"/>
                 <w:bCs w:val="false"/>
-                <w:sz w:val="17"/>
-                <w:szCs w:val="17"/>
+                <w:sz w:val="15"/>
+                <w:szCs w:val="15"/>
               </w:rPr>
               <w:t xml:space="preserve">No</w:t>
+            </w:r>
+          </w:p>
+        </w:tc>
+        <w:tc>
+          <w:tcPr>
+            <w:tcW w:type="dxa" w:w="3280"/>
+            <w:tcBorders>
+              <w:top w:val="none" w:color="FFFFFF" w:sz="0"/>
+              <w:left w:val="none" w:color="FFFFFF" w:sz="0"/>
+              <w:bottom w:val="none" w:color="FFFFFF" w:sz="0"/>
+              <w:right w:val="none" w:color="FFFFFF" w:sz="0"/>
+            </w:tcBorders>
+            <w:shd w:fill="F0F0F0" w:val="clear"/>
+            <w:tcMar>
+              <w:top w:type="dxa" w:w="40"/>
+              <w:left w:type="dxa" w:w="60"/>
+              <w:bottom w:type="dxa" w:w="40"/>
+              <w:right w:type="dxa" w:w="60"/>
+            </w:tcMar>
+            <w:vAlign w:val="center"/>
+          </w:tcPr>
+          <w:p>
+            <w:pPr>
+              <w:jc w:val="center"/>
+            </w:pPr>
+            <w:r>
+              <w:rPr>
+                <w:rFonts w:ascii="Arial" w:cs="Arial" w:eastAsia="Arial" w:hAnsi="Arial"/>
+                <w:color w:val="555555"/>
+                <w:sz w:val="15"/>
+                <w:szCs w:val="15"/>
+              </w:rPr>
+              <w:t xml:space="preserve">G / Y: </w:t>
+            </w:r>
+            <w:r>
+              <w:rPr>
+                <w:rFonts w:ascii="Arial" w:cs="Arial" w:eastAsia="Arial" w:hAnsi="Arial"/>
+                <w:b/>
+                <w:bCs/>
+                <w:sz w:val="15"/>
+                <w:szCs w:val="15"/>
+              </w:rPr>
+              <w:t xml:space="preserve">4.5 (951) / 4.5 (1,239)</w:t>
             </w:r>
           </w:p>
         </w:tc>
@@ -2139,6 +2686,7 @@
     <w:p>
       <w:pPr>
         <w:spacing w:after="0" w:before="60"/>
+        <w:jc w:val="left"/>
       </w:pPr>
       <w:r>
         <w:rPr>
@@ -2146,13 +2694,13 @@
           <w:sz w:val="19"/>
           <w:szCs w:val="19"/>
         </w:rPr>
-        <w:t xml:space="preserve">Two tiers: $69 for 12, $100 for 16. Small counter + outdoor patio at M1. 2,190 Google reviews, the most reviewed on this entire list. Casual vibe. Three locations.</w:t>
+        <w:t xml:space="preserve">Two tiers: $69 for 12, $100 for 16. Small counter + outdoor patio at M1. Most reviewed omakase on this list. Casual vibe. Three locations.</w:t>
       </w:r>
     </w:p>
     <w:p>
       <w:pPr>
         <w:tabs>
-          <w:tab w:val="center" w:pos="5100"/>
+          <w:tab w:val="center" w:pos="5040"/>
         </w:tabs>
         <w:spacing w:after="30" w:before="200"/>
       </w:pPr>
@@ -2196,7 +2744,7 @@
     </w:p>
     <w:tbl>
       <w:tblPr>
-        <w:tblW w:type="dxa" w:w="9360"/>
+        <w:tblW w:type="dxa" w:w="10080"/>
         <w:tblBorders>
           <w:top w:val="single" w:color="auto" w:sz="4"/>
           <w:left w:val="single" w:color="auto" w:sz="4"/>
@@ -2207,15 +2755,16 @@
         </w:tblBorders>
       </w:tblPr>
       <w:tblGrid>
-        <w:gridCol w:w="2340"/>
-        <w:gridCol w:w="2340"/>
-        <w:gridCol w:w="2340"/>
-        <w:gridCol w:w="2340"/>
+        <w:gridCol w:w="1800"/>
+        <w:gridCol w:w="1600"/>
+        <w:gridCol w:w="1700"/>
+        <w:gridCol w:w="1700"/>
+        <w:gridCol w:w="3280"/>
       </w:tblGrid>
       <w:tr>
         <w:tc>
           <w:tcPr>
-            <w:tcW w:type="dxa" w:w="2340"/>
+            <w:tcW w:type="dxa" w:w="1800"/>
             <w:tcBorders>
               <w:top w:val="none" w:color="FFFFFF" w:sz="0"/>
               <w:left w:val="none" w:color="FFFFFF" w:sz="0"/>
@@ -2225,18 +2774,22 @@
             <w:shd w:fill="E6F1FB" w:val="clear"/>
             <w:tcMar>
               <w:top w:type="dxa" w:w="40"/>
-              <w:left w:type="dxa" w:w="80"/>
-              <w:bottom w:type="dxa" w:w="40"/>
-              <w:right w:type="dxa" w:w="80"/>
-            </w:tcMar>
-          </w:tcPr>
-          <w:p>
-            <w:r>
-              <w:rPr>
-                <w:rFonts w:ascii="Arial" w:cs="Arial" w:eastAsia="Arial" w:hAnsi="Arial"/>
-                <w:color w:val="555555"/>
-                <w:sz w:val="17"/>
-                <w:szCs w:val="17"/>
+              <w:left w:type="dxa" w:w="60"/>
+              <w:bottom w:type="dxa" w:w="40"/>
+              <w:right w:type="dxa" w:w="60"/>
+            </w:tcMar>
+            <w:vAlign w:val="center"/>
+          </w:tcPr>
+          <w:p>
+            <w:pPr>
+              <w:jc w:val="center"/>
+            </w:pPr>
+            <w:r>
+              <w:rPr>
+                <w:rFonts w:ascii="Arial" w:cs="Arial" w:eastAsia="Arial" w:hAnsi="Arial"/>
+                <w:color w:val="555555"/>
+                <w:sz w:val="15"/>
+                <w:szCs w:val="15"/>
               </w:rPr>
               <w:t xml:space="preserve">Price: </w:t>
             </w:r>
@@ -2245,8 +2798,8 @@
                 <w:rFonts w:ascii="Arial" w:cs="Arial" w:eastAsia="Arial" w:hAnsi="Arial"/>
                 <w:b/>
                 <w:bCs/>
-                <w:sz w:val="17"/>
-                <w:szCs w:val="17"/>
+                <w:sz w:val="15"/>
+                <w:szCs w:val="15"/>
               </w:rPr>
               <w:t xml:space="preserve">$89</w:t>
             </w:r>
@@ -2254,7 +2807,7 @@
         </w:tc>
         <w:tc>
           <w:tcPr>
-            <w:tcW w:type="dxa" w:w="2340"/>
+            <w:tcW w:type="dxa" w:w="1600"/>
             <w:tcBorders>
               <w:top w:val="none" w:color="FFFFFF" w:sz="0"/>
               <w:left w:val="none" w:color="FFFFFF" w:sz="0"/>
@@ -2264,18 +2817,22 @@
             <w:shd w:fill="E6F1FB" w:val="clear"/>
             <w:tcMar>
               <w:top w:type="dxa" w:w="40"/>
-              <w:left w:type="dxa" w:w="80"/>
-              <w:bottom w:type="dxa" w:w="40"/>
-              <w:right w:type="dxa" w:w="80"/>
-            </w:tcMar>
-          </w:tcPr>
-          <w:p>
-            <w:r>
-              <w:rPr>
-                <w:rFonts w:ascii="Arial" w:cs="Arial" w:eastAsia="Arial" w:hAnsi="Arial"/>
-                <w:color w:val="555555"/>
-                <w:sz w:val="17"/>
-                <w:szCs w:val="17"/>
+              <w:left w:type="dxa" w:w="60"/>
+              <w:bottom w:type="dxa" w:w="40"/>
+              <w:right w:type="dxa" w:w="60"/>
+            </w:tcMar>
+            <w:vAlign w:val="center"/>
+          </w:tcPr>
+          <w:p>
+            <w:pPr>
+              <w:jc w:val="center"/>
+            </w:pPr>
+            <w:r>
+              <w:rPr>
+                <w:rFonts w:ascii="Arial" w:cs="Arial" w:eastAsia="Arial" w:hAnsi="Arial"/>
+                <w:color w:val="555555"/>
+                <w:sz w:val="15"/>
+                <w:szCs w:val="15"/>
               </w:rPr>
               <w:t xml:space="preserve">Courses: </w:t>
             </w:r>
@@ -2284,8 +2841,8 @@
                 <w:rFonts w:ascii="Arial" w:cs="Arial" w:eastAsia="Arial" w:hAnsi="Arial"/>
                 <w:b/>
                 <w:bCs/>
-                <w:sz w:val="17"/>
-                <w:szCs w:val="17"/>
+                <w:sz w:val="15"/>
+                <w:szCs w:val="15"/>
               </w:rPr>
               <w:t xml:space="preserve">14</w:t>
             </w:r>
@@ -2293,7 +2850,7 @@
         </w:tc>
         <w:tc>
           <w:tcPr>
-            <w:tcW w:type="dxa" w:w="2340"/>
+            <w:tcW w:type="dxa" w:w="1700"/>
             <w:tcBorders>
               <w:top w:val="none" w:color="FFFFFF" w:sz="0"/>
               <w:left w:val="none" w:color="FFFFFF" w:sz="0"/>
@@ -2303,18 +2860,22 @@
             <w:shd w:fill="E8F5E9" w:val="clear"/>
             <w:tcMar>
               <w:top w:type="dxa" w:w="40"/>
-              <w:left w:type="dxa" w:w="80"/>
-              <w:bottom w:type="dxa" w:w="40"/>
-              <w:right w:type="dxa" w:w="80"/>
-            </w:tcMar>
-          </w:tcPr>
-          <w:p>
-            <w:r>
-              <w:rPr>
-                <w:rFonts w:ascii="Arial" w:cs="Arial" w:eastAsia="Arial" w:hAnsi="Arial"/>
-                <w:color w:val="555555"/>
-                <w:sz w:val="17"/>
-                <w:szCs w:val="17"/>
+              <w:left w:type="dxa" w:w="60"/>
+              <w:bottom w:type="dxa" w:w="40"/>
+              <w:right w:type="dxa" w:w="60"/>
+            </w:tcMar>
+            <w:vAlign w:val="center"/>
+          </w:tcPr>
+          <w:p>
+            <w:pPr>
+              <w:jc w:val="center"/>
+            </w:pPr>
+            <w:r>
+              <w:rPr>
+                <w:rFonts w:ascii="Arial" w:cs="Arial" w:eastAsia="Arial" w:hAnsi="Arial"/>
+                <w:color w:val="555555"/>
+                <w:sz w:val="15"/>
+                <w:szCs w:val="15"/>
               </w:rPr>
               <w:t xml:space="preserve">Session: </w:t>
             </w:r>
@@ -2323,8 +2884,8 @@
                 <w:rFonts w:ascii="Arial" w:cs="Arial" w:eastAsia="Arial" w:hAnsi="Arial"/>
                 <w:b/>
                 <w:bCs/>
-                <w:sz w:val="17"/>
-                <w:szCs w:val="17"/>
+                <w:sz w:val="15"/>
+                <w:szCs w:val="15"/>
               </w:rPr>
               <w:t xml:space="preserve">60-75 min</w:t>
             </w:r>
@@ -2332,7 +2893,7 @@
         </w:tc>
         <w:tc>
           <w:tcPr>
-            <w:tcW w:type="dxa" w:w="2340"/>
+            <w:tcW w:type="dxa" w:w="1700"/>
             <w:tcBorders>
               <w:top w:val="none" w:color="FFFFFF" w:sz="0"/>
               <w:left w:val="none" w:color="FFFFFF" w:sz="0"/>
@@ -2342,18 +2903,22 @@
             <w:shd w:fill="F1EFE8" w:val="clear"/>
             <w:tcMar>
               <w:top w:type="dxa" w:w="40"/>
-              <w:left w:type="dxa" w:w="80"/>
-              <w:bottom w:type="dxa" w:w="40"/>
-              <w:right w:type="dxa" w:w="80"/>
-            </w:tcMar>
-          </w:tcPr>
-          <w:p>
-            <w:r>
-              <w:rPr>
-                <w:rFonts w:ascii="Arial" w:cs="Arial" w:eastAsia="Arial" w:hAnsi="Arial"/>
-                <w:color w:val="555555"/>
-                <w:sz w:val="17"/>
-                <w:szCs w:val="17"/>
+              <w:left w:type="dxa" w:w="60"/>
+              <w:bottom w:type="dxa" w:w="40"/>
+              <w:right w:type="dxa" w:w="60"/>
+            </w:tcMar>
+            <w:vAlign w:val="center"/>
+          </w:tcPr>
+          <w:p>
+            <w:pPr>
+              <w:jc w:val="center"/>
+            </w:pPr>
+            <w:r>
+              <w:rPr>
+                <w:rFonts w:ascii="Arial" w:cs="Arial" w:eastAsia="Arial" w:hAnsi="Arial"/>
+                <w:color w:val="555555"/>
+                <w:sz w:val="15"/>
+                <w:szCs w:val="15"/>
               </w:rPr>
               <w:t xml:space="preserve">BYOB: </w:t>
             </w:r>
@@ -2362,10 +2927,53 @@
                 <w:rFonts w:ascii="Arial" w:cs="Arial" w:eastAsia="Arial" w:hAnsi="Arial"/>
                 <w:b w:val="false"/>
                 <w:bCs w:val="false"/>
-                <w:sz w:val="17"/>
-                <w:szCs w:val="17"/>
+                <w:sz w:val="15"/>
+                <w:szCs w:val="15"/>
               </w:rPr>
               <w:t xml:space="preserve">No</w:t>
+            </w:r>
+          </w:p>
+        </w:tc>
+        <w:tc>
+          <w:tcPr>
+            <w:tcW w:type="dxa" w:w="3280"/>
+            <w:tcBorders>
+              <w:top w:val="none" w:color="FFFFFF" w:sz="0"/>
+              <w:left w:val="none" w:color="FFFFFF" w:sz="0"/>
+              <w:bottom w:val="none" w:color="FFFFFF" w:sz="0"/>
+              <w:right w:val="none" w:color="FFFFFF" w:sz="0"/>
+            </w:tcBorders>
+            <w:shd w:fill="F0F0F0" w:val="clear"/>
+            <w:tcMar>
+              <w:top w:type="dxa" w:w="40"/>
+              <w:left w:type="dxa" w:w="60"/>
+              <w:bottom w:type="dxa" w:w="40"/>
+              <w:right w:type="dxa" w:w="60"/>
+            </w:tcMar>
+            <w:vAlign w:val="center"/>
+          </w:tcPr>
+          <w:p>
+            <w:pPr>
+              <w:jc w:val="center"/>
+            </w:pPr>
+            <w:r>
+              <w:rPr>
+                <w:rFonts w:ascii="Arial" w:cs="Arial" w:eastAsia="Arial" w:hAnsi="Arial"/>
+                <w:color w:val="555555"/>
+                <w:sz w:val="15"/>
+                <w:szCs w:val="15"/>
+              </w:rPr>
+              <w:t xml:space="preserve">G / Y: </w:t>
+            </w:r>
+            <w:r>
+              <w:rPr>
+                <w:rFonts w:ascii="Arial" w:cs="Arial" w:eastAsia="Arial" w:hAnsi="Arial"/>
+                <w:b/>
+                <w:bCs/>
+                <w:sz w:val="15"/>
+                <w:szCs w:val="15"/>
+              </w:rPr>
+              <w:t xml:space="preserve">4.9 (370) / 4.7 (50)</w:t>
             </w:r>
           </w:p>
         </w:tc>
@@ -2374,6 +2982,7 @@
     <w:p>
       <w:pPr>
         <w:spacing w:after="0" w:before="60"/>
+        <w:jc w:val="left"/>
       </w:pPr>
       <w:r>
         <w:rPr>
@@ -2387,7 +2996,7 @@
     <w:p>
       <w:pPr>
         <w:tabs>
-          <w:tab w:val="center" w:pos="5100"/>
+          <w:tab w:val="center" w:pos="5040"/>
         </w:tabs>
         <w:spacing w:after="30" w:before="200"/>
       </w:pPr>
@@ -2431,7 +3040,7 @@
     </w:p>
     <w:tbl>
       <w:tblPr>
-        <w:tblW w:type="dxa" w:w="9360"/>
+        <w:tblW w:type="dxa" w:w="10080"/>
         <w:tblBorders>
           <w:top w:val="single" w:color="auto" w:sz="4"/>
           <w:left w:val="single" w:color="auto" w:sz="4"/>
@@ -2442,15 +3051,16 @@
         </w:tblBorders>
       </w:tblPr>
       <w:tblGrid>
-        <w:gridCol w:w="2340"/>
-        <w:gridCol w:w="2340"/>
-        <w:gridCol w:w="2340"/>
-        <w:gridCol w:w="2340"/>
+        <w:gridCol w:w="1800"/>
+        <w:gridCol w:w="1600"/>
+        <w:gridCol w:w="1700"/>
+        <w:gridCol w:w="1700"/>
+        <w:gridCol w:w="3280"/>
       </w:tblGrid>
       <w:tr>
         <w:tc>
           <w:tcPr>
-            <w:tcW w:type="dxa" w:w="2340"/>
+            <w:tcW w:type="dxa" w:w="1800"/>
             <w:tcBorders>
               <w:top w:val="none" w:color="FFFFFF" w:sz="0"/>
               <w:left w:val="none" w:color="FFFFFF" w:sz="0"/>
@@ -2460,18 +3070,22 @@
             <w:shd w:fill="E6F1FB" w:val="clear"/>
             <w:tcMar>
               <w:top w:type="dxa" w:w="40"/>
-              <w:left w:type="dxa" w:w="80"/>
-              <w:bottom w:type="dxa" w:w="40"/>
-              <w:right w:type="dxa" w:w="80"/>
-            </w:tcMar>
-          </w:tcPr>
-          <w:p>
-            <w:r>
-              <w:rPr>
-                <w:rFonts w:ascii="Arial" w:cs="Arial" w:eastAsia="Arial" w:hAnsi="Arial"/>
-                <w:color w:val="555555"/>
-                <w:sz w:val="17"/>
-                <w:szCs w:val="17"/>
+              <w:left w:type="dxa" w:w="60"/>
+              <w:bottom w:type="dxa" w:w="40"/>
+              <w:right w:type="dxa" w:w="60"/>
+            </w:tcMar>
+            <w:vAlign w:val="center"/>
+          </w:tcPr>
+          <w:p>
+            <w:pPr>
+              <w:jc w:val="center"/>
+            </w:pPr>
+            <w:r>
+              <w:rPr>
+                <w:rFonts w:ascii="Arial" w:cs="Arial" w:eastAsia="Arial" w:hAnsi="Arial"/>
+                <w:color w:val="555555"/>
+                <w:sz w:val="15"/>
+                <w:szCs w:val="15"/>
               </w:rPr>
               <w:t xml:space="preserve">Price: </w:t>
             </w:r>
@@ -2480,8 +3094,8 @@
                 <w:rFonts w:ascii="Arial" w:cs="Arial" w:eastAsia="Arial" w:hAnsi="Arial"/>
                 <w:b/>
                 <w:bCs/>
-                <w:sz w:val="17"/>
-                <w:szCs w:val="17"/>
+                <w:sz w:val="15"/>
+                <w:szCs w:val="15"/>
               </w:rPr>
               <w:t xml:space="preserve">$75 / $98</w:t>
             </w:r>
@@ -2489,7 +3103,7 @@
         </w:tc>
         <w:tc>
           <w:tcPr>
-            <w:tcW w:type="dxa" w:w="2340"/>
+            <w:tcW w:type="dxa" w:w="1600"/>
             <w:tcBorders>
               <w:top w:val="none" w:color="FFFFFF" w:sz="0"/>
               <w:left w:val="none" w:color="FFFFFF" w:sz="0"/>
@@ -2499,18 +3113,22 @@
             <w:shd w:fill="E6F1FB" w:val="clear"/>
             <w:tcMar>
               <w:top w:type="dxa" w:w="40"/>
-              <w:left w:type="dxa" w:w="80"/>
-              <w:bottom w:type="dxa" w:w="40"/>
-              <w:right w:type="dxa" w:w="80"/>
-            </w:tcMar>
-          </w:tcPr>
-          <w:p>
-            <w:r>
-              <w:rPr>
-                <w:rFonts w:ascii="Arial" w:cs="Arial" w:eastAsia="Arial" w:hAnsi="Arial"/>
-                <w:color w:val="555555"/>
-                <w:sz w:val="17"/>
-                <w:szCs w:val="17"/>
+              <w:left w:type="dxa" w:w="60"/>
+              <w:bottom w:type="dxa" w:w="40"/>
+              <w:right w:type="dxa" w:w="60"/>
+            </w:tcMar>
+            <w:vAlign w:val="center"/>
+          </w:tcPr>
+          <w:p>
+            <w:pPr>
+              <w:jc w:val="center"/>
+            </w:pPr>
+            <w:r>
+              <w:rPr>
+                <w:rFonts w:ascii="Arial" w:cs="Arial" w:eastAsia="Arial" w:hAnsi="Arial"/>
+                <w:color w:val="555555"/>
+                <w:sz w:val="15"/>
+                <w:szCs w:val="15"/>
               </w:rPr>
               <w:t xml:space="preserve">Courses: </w:t>
             </w:r>
@@ -2519,8 +3137,8 @@
                 <w:rFonts w:ascii="Arial" w:cs="Arial" w:eastAsia="Arial" w:hAnsi="Arial"/>
                 <w:b/>
                 <w:bCs/>
-                <w:sz w:val="17"/>
-                <w:szCs w:val="17"/>
+                <w:sz w:val="15"/>
+                <w:szCs w:val="15"/>
               </w:rPr>
               <w:t xml:space="preserve">13 / 15</w:t>
             </w:r>
@@ -2528,7 +3146,7 @@
         </w:tc>
         <w:tc>
           <w:tcPr>
-            <w:tcW w:type="dxa" w:w="2340"/>
+            <w:tcW w:type="dxa" w:w="1700"/>
             <w:tcBorders>
               <w:top w:val="none" w:color="FFFFFF" w:sz="0"/>
               <w:left w:val="none" w:color="FFFFFF" w:sz="0"/>
@@ -2538,18 +3156,22 @@
             <w:shd w:fill="E8F5E9" w:val="clear"/>
             <w:tcMar>
               <w:top w:type="dxa" w:w="40"/>
-              <w:left w:type="dxa" w:w="80"/>
-              <w:bottom w:type="dxa" w:w="40"/>
-              <w:right w:type="dxa" w:w="80"/>
-            </w:tcMar>
-          </w:tcPr>
-          <w:p>
-            <w:r>
-              <w:rPr>
-                <w:rFonts w:ascii="Arial" w:cs="Arial" w:eastAsia="Arial" w:hAnsi="Arial"/>
-                <w:color w:val="555555"/>
-                <w:sz w:val="17"/>
-                <w:szCs w:val="17"/>
+              <w:left w:type="dxa" w:w="60"/>
+              <w:bottom w:type="dxa" w:w="40"/>
+              <w:right w:type="dxa" w:w="60"/>
+            </w:tcMar>
+            <w:vAlign w:val="center"/>
+          </w:tcPr>
+          <w:p>
+            <w:pPr>
+              <w:jc w:val="center"/>
+            </w:pPr>
+            <w:r>
+              <w:rPr>
+                <w:rFonts w:ascii="Arial" w:cs="Arial" w:eastAsia="Arial" w:hAnsi="Arial"/>
+                <w:color w:val="555555"/>
+                <w:sz w:val="15"/>
+                <w:szCs w:val="15"/>
               </w:rPr>
               <w:t xml:space="preserve">Session: </w:t>
             </w:r>
@@ -2558,8 +3180,8 @@
                 <w:rFonts w:ascii="Arial" w:cs="Arial" w:eastAsia="Arial" w:hAnsi="Arial"/>
                 <w:b/>
                 <w:bCs/>
-                <w:sz w:val="17"/>
-                <w:szCs w:val="17"/>
+                <w:sz w:val="15"/>
+                <w:szCs w:val="15"/>
               </w:rPr>
               <w:t xml:space="preserve">60 min</w:t>
             </w:r>
@@ -2567,7 +3189,7 @@
         </w:tc>
         <w:tc>
           <w:tcPr>
-            <w:tcW w:type="dxa" w:w="2340"/>
+            <w:tcW w:type="dxa" w:w="1700"/>
             <w:tcBorders>
               <w:top w:val="none" w:color="FFFFFF" w:sz="0"/>
               <w:left w:val="none" w:color="FFFFFF" w:sz="0"/>
@@ -2577,18 +3199,22 @@
             <w:shd w:fill="F1EFE8" w:val="clear"/>
             <w:tcMar>
               <w:top w:type="dxa" w:w="40"/>
-              <w:left w:type="dxa" w:w="80"/>
-              <w:bottom w:type="dxa" w:w="40"/>
-              <w:right w:type="dxa" w:w="80"/>
-            </w:tcMar>
-          </w:tcPr>
-          <w:p>
-            <w:r>
-              <w:rPr>
-                <w:rFonts w:ascii="Arial" w:cs="Arial" w:eastAsia="Arial" w:hAnsi="Arial"/>
-                <w:color w:val="555555"/>
-                <w:sz w:val="17"/>
-                <w:szCs w:val="17"/>
+              <w:left w:type="dxa" w:w="60"/>
+              <w:bottom w:type="dxa" w:w="40"/>
+              <w:right w:type="dxa" w:w="60"/>
+            </w:tcMar>
+            <w:vAlign w:val="center"/>
+          </w:tcPr>
+          <w:p>
+            <w:pPr>
+              <w:jc w:val="center"/>
+            </w:pPr>
+            <w:r>
+              <w:rPr>
+                <w:rFonts w:ascii="Arial" w:cs="Arial" w:eastAsia="Arial" w:hAnsi="Arial"/>
+                <w:color w:val="555555"/>
+                <w:sz w:val="15"/>
+                <w:szCs w:val="15"/>
               </w:rPr>
               <w:t xml:space="preserve">BYOB: </w:t>
             </w:r>
@@ -2597,10 +3223,53 @@
                 <w:rFonts w:ascii="Arial" w:cs="Arial" w:eastAsia="Arial" w:hAnsi="Arial"/>
                 <w:b/>
                 <w:bCs/>
-                <w:sz w:val="17"/>
-                <w:szCs w:val="17"/>
-              </w:rPr>
-              <w:t xml:space="preserve">Yes, $50 corkage</w:t>
+                <w:sz w:val="15"/>
+                <w:szCs w:val="15"/>
+              </w:rPr>
+              <w:t xml:space="preserve">Yes, $50 fee</w:t>
+            </w:r>
+          </w:p>
+        </w:tc>
+        <w:tc>
+          <w:tcPr>
+            <w:tcW w:type="dxa" w:w="3280"/>
+            <w:tcBorders>
+              <w:top w:val="none" w:color="FFFFFF" w:sz="0"/>
+              <w:left w:val="none" w:color="FFFFFF" w:sz="0"/>
+              <w:bottom w:val="none" w:color="FFFFFF" w:sz="0"/>
+              <w:right w:val="none" w:color="FFFFFF" w:sz="0"/>
+            </w:tcBorders>
+            <w:shd w:fill="F0F0F0" w:val="clear"/>
+            <w:tcMar>
+              <w:top w:type="dxa" w:w="40"/>
+              <w:left w:type="dxa" w:w="60"/>
+              <w:bottom w:type="dxa" w:w="40"/>
+              <w:right w:type="dxa" w:w="60"/>
+            </w:tcMar>
+            <w:vAlign w:val="center"/>
+          </w:tcPr>
+          <w:p>
+            <w:pPr>
+              <w:jc w:val="center"/>
+            </w:pPr>
+            <w:r>
+              <w:rPr>
+                <w:rFonts w:ascii="Arial" w:cs="Arial" w:eastAsia="Arial" w:hAnsi="Arial"/>
+                <w:color w:val="555555"/>
+                <w:sz w:val="15"/>
+                <w:szCs w:val="15"/>
+              </w:rPr>
+              <w:t xml:space="preserve">G / Y: </w:t>
+            </w:r>
+            <w:r>
+              <w:rPr>
+                <w:rFonts w:ascii="Arial" w:cs="Arial" w:eastAsia="Arial" w:hAnsi="Arial"/>
+                <w:b/>
+                <w:bCs/>
+                <w:sz w:val="15"/>
+                <w:szCs w:val="15"/>
+              </w:rPr>
+              <w:t xml:space="preserve">4.8 (1,401) / 4.5 (308)</w:t>
             </w:r>
           </w:p>
         </w:tc>
@@ -2609,6 +3278,7 @@
     <w:p>
       <w:pPr>
         <w:spacing w:after="0" w:before="60"/>
+        <w:jc w:val="left"/>
       </w:pPr>
       <w:r>
         <w:rPr>
@@ -2616,13 +3286,13 @@
           <w:sz w:val="19"/>
           <w:szCs w:val="19"/>
         </w:rPr>
-        <w:t xml:space="preserve">13 at $75, 15 at $98. Chefs Jay and Brian. Two locations. BYOB but now charges $50 corkage. 60 min strict timing.</w:t>
+        <w:t xml:space="preserve">13 at $75, 15 at $98. Chefs Jay and Brian. Two locations. BYOB but now charges $50 fee. 60 min strict timing.</w:t>
       </w:r>
     </w:p>
     <w:p>
       <w:pPr>
         <w:tabs>
-          <w:tab w:val="center" w:pos="5100"/>
+          <w:tab w:val="center" w:pos="5040"/>
         </w:tabs>
         <w:spacing w:after="30" w:before="200"/>
       </w:pPr>
@@ -2666,7 +3336,7 @@
     </w:p>
     <w:tbl>
       <w:tblPr>
-        <w:tblW w:type="dxa" w:w="9360"/>
+        <w:tblW w:type="dxa" w:w="10080"/>
         <w:tblBorders>
           <w:top w:val="single" w:color="auto" w:sz="4"/>
           <w:left w:val="single" w:color="auto" w:sz="4"/>
@@ -2677,15 +3347,16 @@
         </w:tblBorders>
       </w:tblPr>
       <w:tblGrid>
-        <w:gridCol w:w="2340"/>
-        <w:gridCol w:w="2340"/>
-        <w:gridCol w:w="2340"/>
-        <w:gridCol w:w="2340"/>
+        <w:gridCol w:w="1800"/>
+        <w:gridCol w:w="1600"/>
+        <w:gridCol w:w="1700"/>
+        <w:gridCol w:w="1700"/>
+        <w:gridCol w:w="3280"/>
       </w:tblGrid>
       <w:tr>
         <w:tc>
           <w:tcPr>
-            <w:tcW w:type="dxa" w:w="2340"/>
+            <w:tcW w:type="dxa" w:w="1800"/>
             <w:tcBorders>
               <w:top w:val="none" w:color="FFFFFF" w:sz="0"/>
               <w:left w:val="none" w:color="FFFFFF" w:sz="0"/>
@@ -2695,18 +3366,22 @@
             <w:shd w:fill="E6F1FB" w:val="clear"/>
             <w:tcMar>
               <w:top w:type="dxa" w:w="40"/>
-              <w:left w:type="dxa" w:w="80"/>
-              <w:bottom w:type="dxa" w:w="40"/>
-              <w:right w:type="dxa" w:w="80"/>
-            </w:tcMar>
-          </w:tcPr>
-          <w:p>
-            <w:r>
-              <w:rPr>
-                <w:rFonts w:ascii="Arial" w:cs="Arial" w:eastAsia="Arial" w:hAnsi="Arial"/>
-                <w:color w:val="555555"/>
-                <w:sz w:val="17"/>
-                <w:szCs w:val="17"/>
+              <w:left w:type="dxa" w:w="60"/>
+              <w:bottom w:type="dxa" w:w="40"/>
+              <w:right w:type="dxa" w:w="60"/>
+            </w:tcMar>
+            <w:vAlign w:val="center"/>
+          </w:tcPr>
+          <w:p>
+            <w:pPr>
+              <w:jc w:val="center"/>
+            </w:pPr>
+            <w:r>
+              <w:rPr>
+                <w:rFonts w:ascii="Arial" w:cs="Arial" w:eastAsia="Arial" w:hAnsi="Arial"/>
+                <w:color w:val="555555"/>
+                <w:sz w:val="15"/>
+                <w:szCs w:val="15"/>
               </w:rPr>
               <w:t xml:space="preserve">Price: </w:t>
             </w:r>
@@ -2715,8 +3390,8 @@
                 <w:rFonts w:ascii="Arial" w:cs="Arial" w:eastAsia="Arial" w:hAnsi="Arial"/>
                 <w:b/>
                 <w:bCs/>
-                <w:sz w:val="17"/>
-                <w:szCs w:val="17"/>
+                <w:sz w:val="15"/>
+                <w:szCs w:val="15"/>
               </w:rPr>
               <w:t xml:space="preserve">$75 / $85</w:t>
             </w:r>
@@ -2724,7 +3399,7 @@
         </w:tc>
         <w:tc>
           <w:tcPr>
-            <w:tcW w:type="dxa" w:w="2340"/>
+            <w:tcW w:type="dxa" w:w="1600"/>
             <w:tcBorders>
               <w:top w:val="none" w:color="FFFFFF" w:sz="0"/>
               <w:left w:val="none" w:color="FFFFFF" w:sz="0"/>
@@ -2734,18 +3409,22 @@
             <w:shd w:fill="E6F1FB" w:val="clear"/>
             <w:tcMar>
               <w:top w:type="dxa" w:w="40"/>
-              <w:left w:type="dxa" w:w="80"/>
-              <w:bottom w:type="dxa" w:w="40"/>
-              <w:right w:type="dxa" w:w="80"/>
-            </w:tcMar>
-          </w:tcPr>
-          <w:p>
-            <w:r>
-              <w:rPr>
-                <w:rFonts w:ascii="Arial" w:cs="Arial" w:eastAsia="Arial" w:hAnsi="Arial"/>
-                <w:color w:val="555555"/>
-                <w:sz w:val="17"/>
-                <w:szCs w:val="17"/>
+              <w:left w:type="dxa" w:w="60"/>
+              <w:bottom w:type="dxa" w:w="40"/>
+              <w:right w:type="dxa" w:w="60"/>
+            </w:tcMar>
+            <w:vAlign w:val="center"/>
+          </w:tcPr>
+          <w:p>
+            <w:pPr>
+              <w:jc w:val="center"/>
+            </w:pPr>
+            <w:r>
+              <w:rPr>
+                <w:rFonts w:ascii="Arial" w:cs="Arial" w:eastAsia="Arial" w:hAnsi="Arial"/>
+                <w:color w:val="555555"/>
+                <w:sz w:val="15"/>
+                <w:szCs w:val="15"/>
               </w:rPr>
               <w:t xml:space="preserve">Courses: </w:t>
             </w:r>
@@ -2754,8 +3433,8 @@
                 <w:rFonts w:ascii="Arial" w:cs="Arial" w:eastAsia="Arial" w:hAnsi="Arial"/>
                 <w:b/>
                 <w:bCs/>
-                <w:sz w:val="17"/>
-                <w:szCs w:val="17"/>
+                <w:sz w:val="15"/>
+                <w:szCs w:val="15"/>
               </w:rPr>
               <w:t xml:space="preserve">13 / 15</w:t>
             </w:r>
@@ -2763,7 +3442,7 @@
         </w:tc>
         <w:tc>
           <w:tcPr>
-            <w:tcW w:type="dxa" w:w="2340"/>
+            <w:tcW w:type="dxa" w:w="1700"/>
             <w:tcBorders>
               <w:top w:val="none" w:color="FFFFFF" w:sz="0"/>
               <w:left w:val="none" w:color="FFFFFF" w:sz="0"/>
@@ -2773,18 +3452,22 @@
             <w:shd w:fill="E8F5E9" w:val="clear"/>
             <w:tcMar>
               <w:top w:type="dxa" w:w="40"/>
-              <w:left w:type="dxa" w:w="80"/>
-              <w:bottom w:type="dxa" w:w="40"/>
-              <w:right w:type="dxa" w:w="80"/>
-            </w:tcMar>
-          </w:tcPr>
-          <w:p>
-            <w:r>
-              <w:rPr>
-                <w:rFonts w:ascii="Arial" w:cs="Arial" w:eastAsia="Arial" w:hAnsi="Arial"/>
-                <w:color w:val="555555"/>
-                <w:sz w:val="17"/>
-                <w:szCs w:val="17"/>
+              <w:left w:type="dxa" w:w="60"/>
+              <w:bottom w:type="dxa" w:w="40"/>
+              <w:right w:type="dxa" w:w="60"/>
+            </w:tcMar>
+            <w:vAlign w:val="center"/>
+          </w:tcPr>
+          <w:p>
+            <w:pPr>
+              <w:jc w:val="center"/>
+            </w:pPr>
+            <w:r>
+              <w:rPr>
+                <w:rFonts w:ascii="Arial" w:cs="Arial" w:eastAsia="Arial" w:hAnsi="Arial"/>
+                <w:color w:val="555555"/>
+                <w:sz w:val="15"/>
+                <w:szCs w:val="15"/>
               </w:rPr>
               <w:t xml:space="preserve">Session: </w:t>
             </w:r>
@@ -2793,8 +3476,8 @@
                 <w:rFonts w:ascii="Arial" w:cs="Arial" w:eastAsia="Arial" w:hAnsi="Arial"/>
                 <w:b/>
                 <w:bCs/>
-                <w:sz w:val="17"/>
-                <w:szCs w:val="17"/>
+                <w:sz w:val="15"/>
+                <w:szCs w:val="15"/>
               </w:rPr>
               <w:t xml:space="preserve">60-75 min</w:t>
             </w:r>
@@ -2802,7 +3485,7 @@
         </w:tc>
         <w:tc>
           <w:tcPr>
-            <w:tcW w:type="dxa" w:w="2340"/>
+            <w:tcW w:type="dxa" w:w="1700"/>
             <w:tcBorders>
               <w:top w:val="none" w:color="FFFFFF" w:sz="0"/>
               <w:left w:val="none" w:color="FFFFFF" w:sz="0"/>
@@ -2812,18 +3495,22 @@
             <w:shd w:fill="F1EFE8" w:val="clear"/>
             <w:tcMar>
               <w:top w:type="dxa" w:w="40"/>
-              <w:left w:type="dxa" w:w="80"/>
-              <w:bottom w:type="dxa" w:w="40"/>
-              <w:right w:type="dxa" w:w="80"/>
-            </w:tcMar>
-          </w:tcPr>
-          <w:p>
-            <w:r>
-              <w:rPr>
-                <w:rFonts w:ascii="Arial" w:cs="Arial" w:eastAsia="Arial" w:hAnsi="Arial"/>
-                <w:color w:val="555555"/>
-                <w:sz w:val="17"/>
-                <w:szCs w:val="17"/>
+              <w:left w:type="dxa" w:w="60"/>
+              <w:bottom w:type="dxa" w:w="40"/>
+              <w:right w:type="dxa" w:w="60"/>
+            </w:tcMar>
+            <w:vAlign w:val="center"/>
+          </w:tcPr>
+          <w:p>
+            <w:pPr>
+              <w:jc w:val="center"/>
+            </w:pPr>
+            <w:r>
+              <w:rPr>
+                <w:rFonts w:ascii="Arial" w:cs="Arial" w:eastAsia="Arial" w:hAnsi="Arial"/>
+                <w:color w:val="555555"/>
+                <w:sz w:val="15"/>
+                <w:szCs w:val="15"/>
               </w:rPr>
               <w:t xml:space="preserve">BYOB: </w:t>
             </w:r>
@@ -2832,10 +3519,53 @@
                 <w:rFonts w:ascii="Arial" w:cs="Arial" w:eastAsia="Arial" w:hAnsi="Arial"/>
                 <w:b w:val="false"/>
                 <w:bCs w:val="false"/>
-                <w:sz w:val="17"/>
-                <w:szCs w:val="17"/>
+                <w:sz w:val="15"/>
+                <w:szCs w:val="15"/>
               </w:rPr>
               <w:t xml:space="preserve">No</w:t>
+            </w:r>
+          </w:p>
+        </w:tc>
+        <w:tc>
+          <w:tcPr>
+            <w:tcW w:type="dxa" w:w="3280"/>
+            <w:tcBorders>
+              <w:top w:val="none" w:color="FFFFFF" w:sz="0"/>
+              <w:left w:val="none" w:color="FFFFFF" w:sz="0"/>
+              <w:bottom w:val="none" w:color="FFFFFF" w:sz="0"/>
+              <w:right w:val="none" w:color="FFFFFF" w:sz="0"/>
+            </w:tcBorders>
+            <w:shd w:fill="F0F0F0" w:val="clear"/>
+            <w:tcMar>
+              <w:top w:type="dxa" w:w="40"/>
+              <w:left w:type="dxa" w:w="60"/>
+              <w:bottom w:type="dxa" w:w="40"/>
+              <w:right w:type="dxa" w:w="60"/>
+            </w:tcMar>
+            <w:vAlign w:val="center"/>
+          </w:tcPr>
+          <w:p>
+            <w:pPr>
+              <w:jc w:val="center"/>
+            </w:pPr>
+            <w:r>
+              <w:rPr>
+                <w:rFonts w:ascii="Arial" w:cs="Arial" w:eastAsia="Arial" w:hAnsi="Arial"/>
+                <w:color w:val="555555"/>
+                <w:sz w:val="15"/>
+                <w:szCs w:val="15"/>
+              </w:rPr>
+              <w:t xml:space="preserve">G / Y: </w:t>
+            </w:r>
+            <w:r>
+              <w:rPr>
+                <w:rFonts w:ascii="Arial" w:cs="Arial" w:eastAsia="Arial" w:hAnsi="Arial"/>
+                <w:b/>
+                <w:bCs/>
+                <w:sz w:val="15"/>
+                <w:szCs w:val="15"/>
+              </w:rPr>
+              <w:t xml:space="preserve">4.6 (436) / 4.6 (282)</w:t>
             </w:r>
           </w:p>
         </w:tc>
@@ -2844,6 +3574,7 @@
     <w:p>
       <w:pPr>
         <w:spacing w:after="0" w:before="60"/>
+        <w:jc w:val="left"/>
       </w:pPr>
       <w:r>
         <w:rPr>
@@ -2857,7 +3588,7 @@
     <w:p>
       <w:pPr>
         <w:tabs>
-          <w:tab w:val="center" w:pos="5100"/>
+          <w:tab w:val="center" w:pos="5040"/>
         </w:tabs>
         <w:spacing w:after="30" w:before="200"/>
       </w:pPr>
@@ -2901,7 +3632,7 @@
     </w:p>
     <w:tbl>
       <w:tblPr>
-        <w:tblW w:type="dxa" w:w="9360"/>
+        <w:tblW w:type="dxa" w:w="10080"/>
         <w:tblBorders>
           <w:top w:val="single" w:color="auto" w:sz="4"/>
           <w:left w:val="single" w:color="auto" w:sz="4"/>
@@ -2912,15 +3643,16 @@
         </w:tblBorders>
       </w:tblPr>
       <w:tblGrid>
-        <w:gridCol w:w="2340"/>
-        <w:gridCol w:w="2340"/>
-        <w:gridCol w:w="2340"/>
-        <w:gridCol w:w="2340"/>
+        <w:gridCol w:w="1800"/>
+        <w:gridCol w:w="1600"/>
+        <w:gridCol w:w="1700"/>
+        <w:gridCol w:w="1700"/>
+        <w:gridCol w:w="3280"/>
       </w:tblGrid>
       <w:tr>
         <w:tc>
           <w:tcPr>
-            <w:tcW w:type="dxa" w:w="2340"/>
+            <w:tcW w:type="dxa" w:w="1800"/>
             <w:tcBorders>
               <w:top w:val="none" w:color="FFFFFF" w:sz="0"/>
               <w:left w:val="none" w:color="FFFFFF" w:sz="0"/>
@@ -2930,18 +3662,22 @@
             <w:shd w:fill="E6F1FB" w:val="clear"/>
             <w:tcMar>
               <w:top w:type="dxa" w:w="40"/>
-              <w:left w:type="dxa" w:w="80"/>
-              <w:bottom w:type="dxa" w:w="40"/>
-              <w:right w:type="dxa" w:w="80"/>
-            </w:tcMar>
-          </w:tcPr>
-          <w:p>
-            <w:r>
-              <w:rPr>
-                <w:rFonts w:ascii="Arial" w:cs="Arial" w:eastAsia="Arial" w:hAnsi="Arial"/>
-                <w:color w:val="555555"/>
-                <w:sz w:val="17"/>
-                <w:szCs w:val="17"/>
+              <w:left w:type="dxa" w:w="60"/>
+              <w:bottom w:type="dxa" w:w="40"/>
+              <w:right w:type="dxa" w:w="60"/>
+            </w:tcMar>
+            <w:vAlign w:val="center"/>
+          </w:tcPr>
+          <w:p>
+            <w:pPr>
+              <w:jc w:val="center"/>
+            </w:pPr>
+            <w:r>
+              <w:rPr>
+                <w:rFonts w:ascii="Arial" w:cs="Arial" w:eastAsia="Arial" w:hAnsi="Arial"/>
+                <w:color w:val="555555"/>
+                <w:sz w:val="15"/>
+                <w:szCs w:val="15"/>
               </w:rPr>
               <w:t xml:space="preserve">Price: </w:t>
             </w:r>
@@ -2950,8 +3686,8 @@
                 <w:rFonts w:ascii="Arial" w:cs="Arial" w:eastAsia="Arial" w:hAnsi="Arial"/>
                 <w:b/>
                 <w:bCs/>
-                <w:sz w:val="17"/>
-                <w:szCs w:val="17"/>
+                <w:sz w:val="15"/>
+                <w:szCs w:val="15"/>
               </w:rPr>
               <w:t xml:space="preserve">$55</w:t>
             </w:r>
@@ -2959,7 +3695,7 @@
         </w:tc>
         <w:tc>
           <w:tcPr>
-            <w:tcW w:type="dxa" w:w="2340"/>
+            <w:tcW w:type="dxa" w:w="1600"/>
             <w:tcBorders>
               <w:top w:val="none" w:color="FFFFFF" w:sz="0"/>
               <w:left w:val="none" w:color="FFFFFF" w:sz="0"/>
@@ -2969,18 +3705,22 @@
             <w:shd w:fill="E6F1FB" w:val="clear"/>
             <w:tcMar>
               <w:top w:type="dxa" w:w="40"/>
-              <w:left w:type="dxa" w:w="80"/>
-              <w:bottom w:type="dxa" w:w="40"/>
-              <w:right w:type="dxa" w:w="80"/>
-            </w:tcMar>
-          </w:tcPr>
-          <w:p>
-            <w:r>
-              <w:rPr>
-                <w:rFonts w:ascii="Arial" w:cs="Arial" w:eastAsia="Arial" w:hAnsi="Arial"/>
-                <w:color w:val="555555"/>
-                <w:sz w:val="17"/>
-                <w:szCs w:val="17"/>
+              <w:left w:type="dxa" w:w="60"/>
+              <w:bottom w:type="dxa" w:w="40"/>
+              <w:right w:type="dxa" w:w="60"/>
+            </w:tcMar>
+            <w:vAlign w:val="center"/>
+          </w:tcPr>
+          <w:p>
+            <w:pPr>
+              <w:jc w:val="center"/>
+            </w:pPr>
+            <w:r>
+              <w:rPr>
+                <w:rFonts w:ascii="Arial" w:cs="Arial" w:eastAsia="Arial" w:hAnsi="Arial"/>
+                <w:color w:val="555555"/>
+                <w:sz w:val="15"/>
+                <w:szCs w:val="15"/>
               </w:rPr>
               <w:t xml:space="preserve">Courses: </w:t>
             </w:r>
@@ -2989,8 +3729,8 @@
                 <w:rFonts w:ascii="Arial" w:cs="Arial" w:eastAsia="Arial" w:hAnsi="Arial"/>
                 <w:b/>
                 <w:bCs/>
-                <w:sz w:val="17"/>
-                <w:szCs w:val="17"/>
+                <w:sz w:val="15"/>
+                <w:szCs w:val="15"/>
               </w:rPr>
               <w:t xml:space="preserve">13</w:t>
             </w:r>
@@ -2998,7 +3738,7 @@
         </w:tc>
         <w:tc>
           <w:tcPr>
-            <w:tcW w:type="dxa" w:w="2340"/>
+            <w:tcW w:type="dxa" w:w="1700"/>
             <w:tcBorders>
               <w:top w:val="none" w:color="FFFFFF" w:sz="0"/>
               <w:left w:val="none" w:color="FFFFFF" w:sz="0"/>
@@ -3008,18 +3748,22 @@
             <w:shd w:fill="E8F5E9" w:val="clear"/>
             <w:tcMar>
               <w:top w:type="dxa" w:w="40"/>
-              <w:left w:type="dxa" w:w="80"/>
-              <w:bottom w:type="dxa" w:w="40"/>
-              <w:right w:type="dxa" w:w="80"/>
-            </w:tcMar>
-          </w:tcPr>
-          <w:p>
-            <w:r>
-              <w:rPr>
-                <w:rFonts w:ascii="Arial" w:cs="Arial" w:eastAsia="Arial" w:hAnsi="Arial"/>
-                <w:color w:val="555555"/>
-                <w:sz w:val="17"/>
-                <w:szCs w:val="17"/>
+              <w:left w:type="dxa" w:w="60"/>
+              <w:bottom w:type="dxa" w:w="40"/>
+              <w:right w:type="dxa" w:w="60"/>
+            </w:tcMar>
+            <w:vAlign w:val="center"/>
+          </w:tcPr>
+          <w:p>
+            <w:pPr>
+              <w:jc w:val="center"/>
+            </w:pPr>
+            <w:r>
+              <w:rPr>
+                <w:rFonts w:ascii="Arial" w:cs="Arial" w:eastAsia="Arial" w:hAnsi="Arial"/>
+                <w:color w:val="555555"/>
+                <w:sz w:val="15"/>
+                <w:szCs w:val="15"/>
               </w:rPr>
               <w:t xml:space="preserve">Session: </w:t>
             </w:r>
@@ -3028,8 +3772,8 @@
                 <w:rFonts w:ascii="Arial" w:cs="Arial" w:eastAsia="Arial" w:hAnsi="Arial"/>
                 <w:b/>
                 <w:bCs/>
-                <w:sz w:val="17"/>
-                <w:szCs w:val="17"/>
+                <w:sz w:val="15"/>
+                <w:szCs w:val="15"/>
               </w:rPr>
               <w:t xml:space="preserve">60 min</w:t>
             </w:r>
@@ -3037,7 +3781,7 @@
         </w:tc>
         <w:tc>
           <w:tcPr>
-            <w:tcW w:type="dxa" w:w="2340"/>
+            <w:tcW w:type="dxa" w:w="1700"/>
             <w:tcBorders>
               <w:top w:val="none" w:color="FFFFFF" w:sz="0"/>
               <w:left w:val="none" w:color="FFFFFF" w:sz="0"/>
@@ -3047,18 +3791,22 @@
             <w:shd w:fill="F1EFE8" w:val="clear"/>
             <w:tcMar>
               <w:top w:type="dxa" w:w="40"/>
-              <w:left w:type="dxa" w:w="80"/>
-              <w:bottom w:type="dxa" w:w="40"/>
-              <w:right w:type="dxa" w:w="80"/>
-            </w:tcMar>
-          </w:tcPr>
-          <w:p>
-            <w:r>
-              <w:rPr>
-                <w:rFonts w:ascii="Arial" w:cs="Arial" w:eastAsia="Arial" w:hAnsi="Arial"/>
-                <w:color w:val="555555"/>
-                <w:sz w:val="17"/>
-                <w:szCs w:val="17"/>
+              <w:left w:type="dxa" w:w="60"/>
+              <w:bottom w:type="dxa" w:w="40"/>
+              <w:right w:type="dxa" w:w="60"/>
+            </w:tcMar>
+            <w:vAlign w:val="center"/>
+          </w:tcPr>
+          <w:p>
+            <w:pPr>
+              <w:jc w:val="center"/>
+            </w:pPr>
+            <w:r>
+              <w:rPr>
+                <w:rFonts w:ascii="Arial" w:cs="Arial" w:eastAsia="Arial" w:hAnsi="Arial"/>
+                <w:color w:val="555555"/>
+                <w:sz w:val="15"/>
+                <w:szCs w:val="15"/>
               </w:rPr>
               <w:t xml:space="preserve">BYOB: </w:t>
             </w:r>
@@ -3067,10 +3815,53 @@
                 <w:rFonts w:ascii="Arial" w:cs="Arial" w:eastAsia="Arial" w:hAnsi="Arial"/>
                 <w:b w:val="false"/>
                 <w:bCs w:val="false"/>
-                <w:sz w:val="17"/>
-                <w:szCs w:val="17"/>
+                <w:sz w:val="15"/>
+                <w:szCs w:val="15"/>
               </w:rPr>
               <w:t xml:space="preserve">No</w:t>
+            </w:r>
+          </w:p>
+        </w:tc>
+        <w:tc>
+          <w:tcPr>
+            <w:tcW w:type="dxa" w:w="3280"/>
+            <w:tcBorders>
+              <w:top w:val="none" w:color="FFFFFF" w:sz="0"/>
+              <w:left w:val="none" w:color="FFFFFF" w:sz="0"/>
+              <w:bottom w:val="none" w:color="FFFFFF" w:sz="0"/>
+              <w:right w:val="none" w:color="FFFFFF" w:sz="0"/>
+            </w:tcBorders>
+            <w:shd w:fill="F0F0F0" w:val="clear"/>
+            <w:tcMar>
+              <w:top w:type="dxa" w:w="40"/>
+              <w:left w:type="dxa" w:w="60"/>
+              <w:bottom w:type="dxa" w:w="40"/>
+              <w:right w:type="dxa" w:w="60"/>
+            </w:tcMar>
+            <w:vAlign w:val="center"/>
+          </w:tcPr>
+          <w:p>
+            <w:pPr>
+              <w:jc w:val="center"/>
+            </w:pPr>
+            <w:r>
+              <w:rPr>
+                <w:rFonts w:ascii="Arial" w:cs="Arial" w:eastAsia="Arial" w:hAnsi="Arial"/>
+                <w:color w:val="555555"/>
+                <w:sz w:val="15"/>
+                <w:szCs w:val="15"/>
+              </w:rPr>
+              <w:t xml:space="preserve">G / Y: </w:t>
+            </w:r>
+            <w:r>
+              <w:rPr>
+                <w:rFonts w:ascii="Arial" w:cs="Arial" w:eastAsia="Arial" w:hAnsi="Arial"/>
+                <w:b/>
+                <w:bCs/>
+                <w:sz w:val="15"/>
+                <w:szCs w:val="15"/>
+              </w:rPr>
+              <w:t xml:space="preserve">4.7 (326) / 4.5 (125)</w:t>
             </w:r>
           </w:p>
         </w:tc>
@@ -3079,6 +3870,7 @@
     <w:p>
       <w:pPr>
         <w:spacing w:after="0" w:before="60"/>
+        <w:jc w:val="left"/>
       </w:pPr>
       <w:r>
         <w:rPr>
@@ -3091,36 +3883,34 @@
     </w:p>
     <w:p>
       <w:pPr>
-        <w:spacing w:after="4" w:before="200"/>
-      </w:pPr>
+        <w:tabs>
+          <w:tab w:val="center" w:pos="5040"/>
+        </w:tabs>
+        <w:spacing w:after="30" w:before="200"/>
+      </w:pPr>
+      <w:r>
+        <w:rPr>
+          <w:rFonts w:ascii="Arial" w:cs="Arial" w:eastAsia="Arial" w:hAnsi="Arial"/>
+          <w:color w:val="888888"/>
+          <w:sz w:val="19"/>
+          <w:szCs w:val="19"/>
+        </w:rPr>
+        <w:t xml:space="preserve">#14</w:t>
+      </w:r>
+      <w:r>
+        <w:t xml:space="preserve">  </w:t>
+      </w:r>
       <w:r>
         <w:rPr>
           <w:rFonts w:ascii="Arial" w:cs="Arial" w:eastAsia="Arial" w:hAnsi="Arial"/>
           <w:b/>
           <w:bCs/>
           <w:color w:val="C25A3C"/>
-          <w:sz w:val="15"/>
-          <w:szCs w:val="15"/>
+          <w:sz w:val="14"/>
+          <w:szCs w:val="14"/>
           <w:shd w:fill="FBEAEA" w:val="clear"/>
         </w:rPr>
-        <w:t xml:space="preserve">  Visited together  </w:t>
-      </w:r>
-    </w:p>
-    <w:p>
-      <w:pPr>
-        <w:tabs>
-          <w:tab w:val="center" w:pos="5100"/>
-        </w:tabs>
-        <w:spacing w:after="30" w:before="4"/>
-      </w:pPr>
-      <w:r>
-        <w:rPr>
-          <w:rFonts w:ascii="Arial" w:cs="Arial" w:eastAsia="Arial" w:hAnsi="Arial"/>
-          <w:color w:val="888888"/>
-          <w:sz w:val="19"/>
-          <w:szCs w:val="19"/>
-        </w:rPr>
-        <w:t xml:space="preserve">#14</w:t>
+        <w:t xml:space="preserve"> Visited together </w:t>
       </w:r>
       <w:r>
         <w:t xml:space="preserve">	</w:t>
@@ -3153,7 +3943,7 @@
     </w:p>
     <w:tbl>
       <w:tblPr>
-        <w:tblW w:type="dxa" w:w="9360"/>
+        <w:tblW w:type="dxa" w:w="10080"/>
         <w:tblBorders>
           <w:top w:val="single" w:color="auto" w:sz="4"/>
           <w:left w:val="single" w:color="auto" w:sz="4"/>
@@ -3164,15 +3954,16 @@
         </w:tblBorders>
       </w:tblPr>
       <w:tblGrid>
-        <w:gridCol w:w="2340"/>
-        <w:gridCol w:w="2340"/>
-        <w:gridCol w:w="2340"/>
-        <w:gridCol w:w="2340"/>
+        <w:gridCol w:w="1800"/>
+        <w:gridCol w:w="1600"/>
+        <w:gridCol w:w="1700"/>
+        <w:gridCol w:w="1700"/>
+        <w:gridCol w:w="3280"/>
       </w:tblGrid>
       <w:tr>
         <w:tc>
           <w:tcPr>
-            <w:tcW w:type="dxa" w:w="2340"/>
+            <w:tcW w:type="dxa" w:w="1800"/>
             <w:tcBorders>
               <w:top w:val="none" w:color="FFFFFF" w:sz="0"/>
               <w:left w:val="none" w:color="FFFFFF" w:sz="0"/>
@@ -3182,18 +3973,22 @@
             <w:shd w:fill="E6F1FB" w:val="clear"/>
             <w:tcMar>
               <w:top w:type="dxa" w:w="40"/>
-              <w:left w:type="dxa" w:w="80"/>
-              <w:bottom w:type="dxa" w:w="40"/>
-              <w:right w:type="dxa" w:w="80"/>
-            </w:tcMar>
-          </w:tcPr>
-          <w:p>
-            <w:r>
-              <w:rPr>
-                <w:rFonts w:ascii="Arial" w:cs="Arial" w:eastAsia="Arial" w:hAnsi="Arial"/>
-                <w:color w:val="555555"/>
-                <w:sz w:val="17"/>
-                <w:szCs w:val="17"/>
+              <w:left w:type="dxa" w:w="60"/>
+              <w:bottom w:type="dxa" w:w="40"/>
+              <w:right w:type="dxa" w:w="60"/>
+            </w:tcMar>
+            <w:vAlign w:val="center"/>
+          </w:tcPr>
+          <w:p>
+            <w:pPr>
+              <w:jc w:val="center"/>
+            </w:pPr>
+            <w:r>
+              <w:rPr>
+                <w:rFonts w:ascii="Arial" w:cs="Arial" w:eastAsia="Arial" w:hAnsi="Arial"/>
+                <w:color w:val="555555"/>
+                <w:sz w:val="15"/>
+                <w:szCs w:val="15"/>
               </w:rPr>
               <w:t xml:space="preserve">Price: </w:t>
             </w:r>
@@ -3202,8 +3997,8 @@
                 <w:rFonts w:ascii="Arial" w:cs="Arial" w:eastAsia="Arial" w:hAnsi="Arial"/>
                 <w:b/>
                 <w:bCs/>
-                <w:sz w:val="17"/>
-                <w:szCs w:val="17"/>
+                <w:sz w:val="15"/>
+                <w:szCs w:val="15"/>
               </w:rPr>
               <w:t xml:space="preserve">$65 / $100</w:t>
             </w:r>
@@ -3211,7 +4006,7 @@
         </w:tc>
         <w:tc>
           <w:tcPr>
-            <w:tcW w:type="dxa" w:w="2340"/>
+            <w:tcW w:type="dxa" w:w="1600"/>
             <w:tcBorders>
               <w:top w:val="none" w:color="FFFFFF" w:sz="0"/>
               <w:left w:val="none" w:color="FFFFFF" w:sz="0"/>
@@ -3221,18 +4016,22 @@
             <w:shd w:fill="E6F1FB" w:val="clear"/>
             <w:tcMar>
               <w:top w:type="dxa" w:w="40"/>
-              <w:left w:type="dxa" w:w="80"/>
-              <w:bottom w:type="dxa" w:w="40"/>
-              <w:right w:type="dxa" w:w="80"/>
-            </w:tcMar>
-          </w:tcPr>
-          <w:p>
-            <w:r>
-              <w:rPr>
-                <w:rFonts w:ascii="Arial" w:cs="Arial" w:eastAsia="Arial" w:hAnsi="Arial"/>
-                <w:color w:val="555555"/>
-                <w:sz w:val="17"/>
-                <w:szCs w:val="17"/>
+              <w:left w:type="dxa" w:w="60"/>
+              <w:bottom w:type="dxa" w:w="40"/>
+              <w:right w:type="dxa" w:w="60"/>
+            </w:tcMar>
+            <w:vAlign w:val="center"/>
+          </w:tcPr>
+          <w:p>
+            <w:pPr>
+              <w:jc w:val="center"/>
+            </w:pPr>
+            <w:r>
+              <w:rPr>
+                <w:rFonts w:ascii="Arial" w:cs="Arial" w:eastAsia="Arial" w:hAnsi="Arial"/>
+                <w:color w:val="555555"/>
+                <w:sz w:val="15"/>
+                <w:szCs w:val="15"/>
               </w:rPr>
               <w:t xml:space="preserve">Courses: </w:t>
             </w:r>
@@ -3241,8 +4040,8 @@
                 <w:rFonts w:ascii="Arial" w:cs="Arial" w:eastAsia="Arial" w:hAnsi="Arial"/>
                 <w:b/>
                 <w:bCs/>
-                <w:sz w:val="17"/>
-                <w:szCs w:val="17"/>
+                <w:sz w:val="15"/>
+                <w:szCs w:val="15"/>
               </w:rPr>
               <w:t xml:space="preserve">12 / 17</w:t>
             </w:r>
@@ -3250,7 +4049,7 @@
         </w:tc>
         <w:tc>
           <w:tcPr>
-            <w:tcW w:type="dxa" w:w="2340"/>
+            <w:tcW w:type="dxa" w:w="1700"/>
             <w:tcBorders>
               <w:top w:val="none" w:color="FFFFFF" w:sz="0"/>
               <w:left w:val="none" w:color="FFFFFF" w:sz="0"/>
@@ -3260,18 +4059,22 @@
             <w:shd w:fill="E8F5E9" w:val="clear"/>
             <w:tcMar>
               <w:top w:type="dxa" w:w="40"/>
-              <w:left w:type="dxa" w:w="80"/>
-              <w:bottom w:type="dxa" w:w="40"/>
-              <w:right w:type="dxa" w:w="80"/>
-            </w:tcMar>
-          </w:tcPr>
-          <w:p>
-            <w:r>
-              <w:rPr>
-                <w:rFonts w:ascii="Arial" w:cs="Arial" w:eastAsia="Arial" w:hAnsi="Arial"/>
-                <w:color w:val="555555"/>
-                <w:sz w:val="17"/>
-                <w:szCs w:val="17"/>
+              <w:left w:type="dxa" w:w="60"/>
+              <w:bottom w:type="dxa" w:w="40"/>
+              <w:right w:type="dxa" w:w="60"/>
+            </w:tcMar>
+            <w:vAlign w:val="center"/>
+          </w:tcPr>
+          <w:p>
+            <w:pPr>
+              <w:jc w:val="center"/>
+            </w:pPr>
+            <w:r>
+              <w:rPr>
+                <w:rFonts w:ascii="Arial" w:cs="Arial" w:eastAsia="Arial" w:hAnsi="Arial"/>
+                <w:color w:val="555555"/>
+                <w:sz w:val="15"/>
+                <w:szCs w:val="15"/>
               </w:rPr>
               <w:t xml:space="preserve">Session: </w:t>
             </w:r>
@@ -3280,8 +4083,8 @@
                 <w:rFonts w:ascii="Arial" w:cs="Arial" w:eastAsia="Arial" w:hAnsi="Arial"/>
                 <w:b/>
                 <w:bCs/>
-                <w:sz w:val="17"/>
-                <w:szCs w:val="17"/>
+                <w:sz w:val="15"/>
+                <w:szCs w:val="15"/>
               </w:rPr>
               <w:t xml:space="preserve">45-60 min</w:t>
             </w:r>
@@ -3289,7 +4092,7 @@
         </w:tc>
         <w:tc>
           <w:tcPr>
-            <w:tcW w:type="dxa" w:w="2340"/>
+            <w:tcW w:type="dxa" w:w="1700"/>
             <w:tcBorders>
               <w:top w:val="none" w:color="FFFFFF" w:sz="0"/>
               <w:left w:val="none" w:color="FFFFFF" w:sz="0"/>
@@ -3299,18 +4102,22 @@
             <w:shd w:fill="F1EFE8" w:val="clear"/>
             <w:tcMar>
               <w:top w:type="dxa" w:w="40"/>
-              <w:left w:type="dxa" w:w="80"/>
-              <w:bottom w:type="dxa" w:w="40"/>
-              <w:right w:type="dxa" w:w="80"/>
-            </w:tcMar>
-          </w:tcPr>
-          <w:p>
-            <w:r>
-              <w:rPr>
-                <w:rFonts w:ascii="Arial" w:cs="Arial" w:eastAsia="Arial" w:hAnsi="Arial"/>
-                <w:color w:val="555555"/>
-                <w:sz w:val="17"/>
-                <w:szCs w:val="17"/>
+              <w:left w:type="dxa" w:w="60"/>
+              <w:bottom w:type="dxa" w:w="40"/>
+              <w:right w:type="dxa" w:w="60"/>
+            </w:tcMar>
+            <w:vAlign w:val="center"/>
+          </w:tcPr>
+          <w:p>
+            <w:pPr>
+              <w:jc w:val="center"/>
+            </w:pPr>
+            <w:r>
+              <w:rPr>
+                <w:rFonts w:ascii="Arial" w:cs="Arial" w:eastAsia="Arial" w:hAnsi="Arial"/>
+                <w:color w:val="555555"/>
+                <w:sz w:val="15"/>
+                <w:szCs w:val="15"/>
               </w:rPr>
               <w:t xml:space="preserve">BYOB: </w:t>
             </w:r>
@@ -3319,10 +4126,53 @@
                 <w:rFonts w:ascii="Arial" w:cs="Arial" w:eastAsia="Arial" w:hAnsi="Arial"/>
                 <w:b/>
                 <w:bCs/>
-                <w:sz w:val="17"/>
-                <w:szCs w:val="17"/>
-              </w:rPr>
-              <w:t xml:space="preserve">Yes, $20 corkage</w:t>
+                <w:sz w:val="15"/>
+                <w:szCs w:val="15"/>
+              </w:rPr>
+              <w:t xml:space="preserve">Yes, $20 fee</w:t>
+            </w:r>
+          </w:p>
+        </w:tc>
+        <w:tc>
+          <w:tcPr>
+            <w:tcW w:type="dxa" w:w="3280"/>
+            <w:tcBorders>
+              <w:top w:val="none" w:color="FFFFFF" w:sz="0"/>
+              <w:left w:val="none" w:color="FFFFFF" w:sz="0"/>
+              <w:bottom w:val="none" w:color="FFFFFF" w:sz="0"/>
+              <w:right w:val="none" w:color="FFFFFF" w:sz="0"/>
+            </w:tcBorders>
+            <w:shd w:fill="F0F0F0" w:val="clear"/>
+            <w:tcMar>
+              <w:top w:type="dxa" w:w="40"/>
+              <w:left w:type="dxa" w:w="60"/>
+              <w:bottom w:type="dxa" w:w="40"/>
+              <w:right w:type="dxa" w:w="60"/>
+            </w:tcMar>
+            <w:vAlign w:val="center"/>
+          </w:tcPr>
+          <w:p>
+            <w:pPr>
+              <w:jc w:val="center"/>
+            </w:pPr>
+            <w:r>
+              <w:rPr>
+                <w:rFonts w:ascii="Arial" w:cs="Arial" w:eastAsia="Arial" w:hAnsi="Arial"/>
+                <w:color w:val="555555"/>
+                <w:sz w:val="15"/>
+                <w:szCs w:val="15"/>
+              </w:rPr>
+              <w:t xml:space="preserve">G / Y: </w:t>
+            </w:r>
+            <w:r>
+              <w:rPr>
+                <w:rFonts w:ascii="Arial" w:cs="Arial" w:eastAsia="Arial" w:hAnsi="Arial"/>
+                <w:b/>
+                <w:bCs/>
+                <w:sz w:val="15"/>
+                <w:szCs w:val="15"/>
+              </w:rPr>
+              <w:t xml:space="preserve">4.5 (458) / 4.5 (653)</w:t>
             </w:r>
           </w:p>
         </w:tc>
@@ -3331,6 +4181,7 @@
     <w:p>
       <w:pPr>
         <w:spacing w:after="0" w:before="60"/>
+        <w:jc w:val="left"/>
       </w:pPr>
       <w:r>
         <w:rPr>
@@ -3338,41 +4189,39 @@
           <w:sz w:val="19"/>
           <w:szCs w:val="19"/>
         </w:rPr>
-        <w:t xml:space="preserve">12-seat omakase run by chef duo Lin and Jackie. Name means "four seasons" in Japanese. Sources the best seasonal seafood worldwide. Known for fast pacing and playful presentation. Seared A5 Wagyu highlight. BYOB with $20 corkage.</w:t>
-      </w:r>
-    </w:p>
-    <w:p>
-      <w:pPr>
-        <w:spacing w:after="4" w:before="200"/>
-      </w:pPr>
+        <w:t xml:space="preserve">12-seat omakase run by chef duo Lin and Jackie. Name means "four seasons" in Japanese. Known for fast pacing and playful presentation. Seared A5 Wagyu highlight. BYOB with $20 fee.</w:t>
+      </w:r>
+    </w:p>
+    <w:p>
+      <w:pPr>
+        <w:tabs>
+          <w:tab w:val="center" w:pos="5040"/>
+        </w:tabs>
+        <w:spacing w:after="30" w:before="200"/>
+      </w:pPr>
+      <w:r>
+        <w:rPr>
+          <w:rFonts w:ascii="Arial" w:cs="Arial" w:eastAsia="Arial" w:hAnsi="Arial"/>
+          <w:color w:val="888888"/>
+          <w:sz w:val="19"/>
+          <w:szCs w:val="19"/>
+        </w:rPr>
+        <w:t xml:space="preserve">#15</w:t>
+      </w:r>
+      <w:r>
+        <w:t xml:space="preserve">  </w:t>
+      </w:r>
       <w:r>
         <w:rPr>
           <w:rFonts w:ascii="Arial" w:cs="Arial" w:eastAsia="Arial" w:hAnsi="Arial"/>
           <w:b/>
           <w:bCs/>
           <w:color w:val="E8900C"/>
-          <w:sz w:val="15"/>
-          <w:szCs w:val="15"/>
+          <w:sz w:val="14"/>
+          <w:szCs w:val="14"/>
           <w:shd w:fill="FFF3E0" w:val="clear"/>
         </w:rPr>
-        <w:t xml:space="preserve">  Friend recommendation  </w:t>
-      </w:r>
-    </w:p>
-    <w:p>
-      <w:pPr>
-        <w:tabs>
-          <w:tab w:val="center" w:pos="5100"/>
-        </w:tabs>
-        <w:spacing w:after="30" w:before="4"/>
-      </w:pPr>
-      <w:r>
-        <w:rPr>
-          <w:rFonts w:ascii="Arial" w:cs="Arial" w:eastAsia="Arial" w:hAnsi="Arial"/>
-          <w:color w:val="888888"/>
-          <w:sz w:val="19"/>
-          <w:szCs w:val="19"/>
-        </w:rPr>
-        <w:t xml:space="preserve">#15</w:t>
+        <w:t xml:space="preserve"> Friend rec </w:t>
       </w:r>
       <w:r>
         <w:t xml:space="preserve">	</w:t>
@@ -3405,7 +4254,7 @@
     </w:p>
     <w:tbl>
       <w:tblPr>
-        <w:tblW w:type="dxa" w:w="9360"/>
+        <w:tblW w:type="dxa" w:w="10080"/>
         <w:tblBorders>
           <w:top w:val="single" w:color="auto" w:sz="4"/>
           <w:left w:val="single" w:color="auto" w:sz="4"/>
@@ -3416,15 +4265,16 @@
         </w:tblBorders>
       </w:tblPr>
       <w:tblGrid>
-        <w:gridCol w:w="2340"/>
-        <w:gridCol w:w="2340"/>
-        <w:gridCol w:w="2340"/>
-        <w:gridCol w:w="2340"/>
+        <w:gridCol w:w="1800"/>
+        <w:gridCol w:w="1600"/>
+        <w:gridCol w:w="1700"/>
+        <w:gridCol w:w="1700"/>
+        <w:gridCol w:w="3280"/>
       </w:tblGrid>
       <w:tr>
         <w:tc>
           <w:tcPr>
-            <w:tcW w:type="dxa" w:w="2340"/>
+            <w:tcW w:type="dxa" w:w="1800"/>
             <w:tcBorders>
               <w:top w:val="none" w:color="FFFFFF" w:sz="0"/>
               <w:left w:val="none" w:color="FFFFFF" w:sz="0"/>
@@ -3434,18 +4284,22 @@
             <w:shd w:fill="E6F1FB" w:val="clear"/>
             <w:tcMar>
               <w:top w:type="dxa" w:w="40"/>
-              <w:left w:type="dxa" w:w="80"/>
-              <w:bottom w:type="dxa" w:w="40"/>
-              <w:right w:type="dxa" w:w="80"/>
-            </w:tcMar>
-          </w:tcPr>
-          <w:p>
-            <w:r>
-              <w:rPr>
-                <w:rFonts w:ascii="Arial" w:cs="Arial" w:eastAsia="Arial" w:hAnsi="Arial"/>
-                <w:color w:val="555555"/>
-                <w:sz w:val="17"/>
-                <w:szCs w:val="17"/>
+              <w:left w:type="dxa" w:w="60"/>
+              <w:bottom w:type="dxa" w:w="40"/>
+              <w:right w:type="dxa" w:w="60"/>
+            </w:tcMar>
+            <w:vAlign w:val="center"/>
+          </w:tcPr>
+          <w:p>
+            <w:pPr>
+              <w:jc w:val="center"/>
+            </w:pPr>
+            <w:r>
+              <w:rPr>
+                <w:rFonts w:ascii="Arial" w:cs="Arial" w:eastAsia="Arial" w:hAnsi="Arial"/>
+                <w:color w:val="555555"/>
+                <w:sz w:val="15"/>
+                <w:szCs w:val="15"/>
               </w:rPr>
               <w:t xml:space="preserve">Price: </w:t>
             </w:r>
@@ -3454,8 +4308,8 @@
                 <w:rFonts w:ascii="Arial" w:cs="Arial" w:eastAsia="Arial" w:hAnsi="Arial"/>
                 <w:b/>
                 <w:bCs/>
-                <w:sz w:val="17"/>
-                <w:szCs w:val="17"/>
+                <w:sz w:val="15"/>
+                <w:szCs w:val="15"/>
               </w:rPr>
               <w:t xml:space="preserve">$85 / $100</w:t>
             </w:r>
@@ -3463,7 +4317,7 @@
         </w:tc>
         <w:tc>
           <w:tcPr>
-            <w:tcW w:type="dxa" w:w="2340"/>
+            <w:tcW w:type="dxa" w:w="1600"/>
             <w:tcBorders>
               <w:top w:val="none" w:color="FFFFFF" w:sz="0"/>
               <w:left w:val="none" w:color="FFFFFF" w:sz="0"/>
@@ -3473,18 +4327,22 @@
             <w:shd w:fill="E6F1FB" w:val="clear"/>
             <w:tcMar>
               <w:top w:type="dxa" w:w="40"/>
-              <w:left w:type="dxa" w:w="80"/>
-              <w:bottom w:type="dxa" w:w="40"/>
-              <w:right w:type="dxa" w:w="80"/>
-            </w:tcMar>
-          </w:tcPr>
-          <w:p>
-            <w:r>
-              <w:rPr>
-                <w:rFonts w:ascii="Arial" w:cs="Arial" w:eastAsia="Arial" w:hAnsi="Arial"/>
-                <w:color w:val="555555"/>
-                <w:sz w:val="17"/>
-                <w:szCs w:val="17"/>
+              <w:left w:type="dxa" w:w="60"/>
+              <w:bottom w:type="dxa" w:w="40"/>
+              <w:right w:type="dxa" w:w="60"/>
+            </w:tcMar>
+            <w:vAlign w:val="center"/>
+          </w:tcPr>
+          <w:p>
+            <w:pPr>
+              <w:jc w:val="center"/>
+            </w:pPr>
+            <w:r>
+              <w:rPr>
+                <w:rFonts w:ascii="Arial" w:cs="Arial" w:eastAsia="Arial" w:hAnsi="Arial"/>
+                <w:color w:val="555555"/>
+                <w:sz w:val="15"/>
+                <w:szCs w:val="15"/>
               </w:rPr>
               <w:t xml:space="preserve">Courses: </w:t>
             </w:r>
@@ -3493,8 +4351,8 @@
                 <w:rFonts w:ascii="Arial" w:cs="Arial" w:eastAsia="Arial" w:hAnsi="Arial"/>
                 <w:b/>
                 <w:bCs/>
-                <w:sz w:val="17"/>
-                <w:szCs w:val="17"/>
+                <w:sz w:val="15"/>
+                <w:szCs w:val="15"/>
               </w:rPr>
               <w:t xml:space="preserve">17</w:t>
             </w:r>
@@ -3502,7 +4360,7 @@
         </w:tc>
         <w:tc>
           <w:tcPr>
-            <w:tcW w:type="dxa" w:w="2340"/>
+            <w:tcW w:type="dxa" w:w="1700"/>
             <w:tcBorders>
               <w:top w:val="none" w:color="FFFFFF" w:sz="0"/>
               <w:left w:val="none" w:color="FFFFFF" w:sz="0"/>
@@ -3512,18 +4370,22 @@
             <w:shd w:fill="E8F5E9" w:val="clear"/>
             <w:tcMar>
               <w:top w:type="dxa" w:w="40"/>
-              <w:left w:type="dxa" w:w="80"/>
-              <w:bottom w:type="dxa" w:w="40"/>
-              <w:right w:type="dxa" w:w="80"/>
-            </w:tcMar>
-          </w:tcPr>
-          <w:p>
-            <w:r>
-              <w:rPr>
-                <w:rFonts w:ascii="Arial" w:cs="Arial" w:eastAsia="Arial" w:hAnsi="Arial"/>
-                <w:color w:val="555555"/>
-                <w:sz w:val="17"/>
-                <w:szCs w:val="17"/>
+              <w:left w:type="dxa" w:w="60"/>
+              <w:bottom w:type="dxa" w:w="40"/>
+              <w:right w:type="dxa" w:w="60"/>
+            </w:tcMar>
+            <w:vAlign w:val="center"/>
+          </w:tcPr>
+          <w:p>
+            <w:pPr>
+              <w:jc w:val="center"/>
+            </w:pPr>
+            <w:r>
+              <w:rPr>
+                <w:rFonts w:ascii="Arial" w:cs="Arial" w:eastAsia="Arial" w:hAnsi="Arial"/>
+                <w:color w:val="555555"/>
+                <w:sz w:val="15"/>
+                <w:szCs w:val="15"/>
               </w:rPr>
               <w:t xml:space="preserve">Session: </w:t>
             </w:r>
@@ -3532,8 +4394,8 @@
                 <w:rFonts w:ascii="Arial" w:cs="Arial" w:eastAsia="Arial" w:hAnsi="Arial"/>
                 <w:b/>
                 <w:bCs/>
-                <w:sz w:val="17"/>
-                <w:szCs w:val="17"/>
+                <w:sz w:val="15"/>
+                <w:szCs w:val="15"/>
               </w:rPr>
               <w:t xml:space="preserve">75-90 min</w:t>
             </w:r>
@@ -3541,7 +4403,7 @@
         </w:tc>
         <w:tc>
           <w:tcPr>
-            <w:tcW w:type="dxa" w:w="2340"/>
+            <w:tcW w:type="dxa" w:w="1700"/>
             <w:tcBorders>
               <w:top w:val="none" w:color="FFFFFF" w:sz="0"/>
               <w:left w:val="none" w:color="FFFFFF" w:sz="0"/>
@@ -3551,18 +4413,22 @@
             <w:shd w:fill="F1EFE8" w:val="clear"/>
             <w:tcMar>
               <w:top w:type="dxa" w:w="40"/>
-              <w:left w:type="dxa" w:w="80"/>
-              <w:bottom w:type="dxa" w:w="40"/>
-              <w:right w:type="dxa" w:w="80"/>
-            </w:tcMar>
-          </w:tcPr>
-          <w:p>
-            <w:r>
-              <w:rPr>
-                <w:rFonts w:ascii="Arial" w:cs="Arial" w:eastAsia="Arial" w:hAnsi="Arial"/>
-                <w:color w:val="555555"/>
-                <w:sz w:val="17"/>
-                <w:szCs w:val="17"/>
+              <w:left w:type="dxa" w:w="60"/>
+              <w:bottom w:type="dxa" w:w="40"/>
+              <w:right w:type="dxa" w:w="60"/>
+            </w:tcMar>
+            <w:vAlign w:val="center"/>
+          </w:tcPr>
+          <w:p>
+            <w:pPr>
+              <w:jc w:val="center"/>
+            </w:pPr>
+            <w:r>
+              <w:rPr>
+                <w:rFonts w:ascii="Arial" w:cs="Arial" w:eastAsia="Arial" w:hAnsi="Arial"/>
+                <w:color w:val="555555"/>
+                <w:sz w:val="15"/>
+                <w:szCs w:val="15"/>
               </w:rPr>
               <w:t xml:space="preserve">BYOB: </w:t>
             </w:r>
@@ -3571,10 +4437,53 @@
                 <w:rFonts w:ascii="Arial" w:cs="Arial" w:eastAsia="Arial" w:hAnsi="Arial"/>
                 <w:b w:val="false"/>
                 <w:bCs w:val="false"/>
-                <w:sz w:val="17"/>
-                <w:szCs w:val="17"/>
+                <w:sz w:val="15"/>
+                <w:szCs w:val="15"/>
               </w:rPr>
               <w:t xml:space="preserve">No</w:t>
+            </w:r>
+          </w:p>
+        </w:tc>
+        <w:tc>
+          <w:tcPr>
+            <w:tcW w:type="dxa" w:w="3280"/>
+            <w:tcBorders>
+              <w:top w:val="none" w:color="FFFFFF" w:sz="0"/>
+              <w:left w:val="none" w:color="FFFFFF" w:sz="0"/>
+              <w:bottom w:val="none" w:color="FFFFFF" w:sz="0"/>
+              <w:right w:val="none" w:color="FFFFFF" w:sz="0"/>
+            </w:tcBorders>
+            <w:shd w:fill="F0F0F0" w:val="clear"/>
+            <w:tcMar>
+              <w:top w:type="dxa" w:w="40"/>
+              <w:left w:type="dxa" w:w="60"/>
+              <w:bottom w:type="dxa" w:w="40"/>
+              <w:right w:type="dxa" w:w="60"/>
+            </w:tcMar>
+            <w:vAlign w:val="center"/>
+          </w:tcPr>
+          <w:p>
+            <w:pPr>
+              <w:jc w:val="center"/>
+            </w:pPr>
+            <w:r>
+              <w:rPr>
+                <w:rFonts w:ascii="Arial" w:cs="Arial" w:eastAsia="Arial" w:hAnsi="Arial"/>
+                <w:color w:val="555555"/>
+                <w:sz w:val="15"/>
+                <w:szCs w:val="15"/>
+              </w:rPr>
+              <w:t xml:space="preserve">G / Y: </w:t>
+            </w:r>
+            <w:r>
+              <w:rPr>
+                <w:rFonts w:ascii="Arial" w:cs="Arial" w:eastAsia="Arial" w:hAnsi="Arial"/>
+                <w:b/>
+                <w:bCs/>
+                <w:sz w:val="15"/>
+                <w:szCs w:val="15"/>
+              </w:rPr>
+              <w:t xml:space="preserve">4.8 (67) / -</w:t>
             </w:r>
           </w:p>
         </w:tc>
@@ -3583,6 +4492,7 @@
     <w:p>
       <w:pPr>
         <w:spacing w:after="0" w:before="60"/>
+        <w:jc w:val="left"/>
       </w:pPr>
       <w:r>
         <w:rPr>
@@ -3590,7 +4500,7 @@
           <w:sz w:val="19"/>
           <w:szCs w:val="19"/>
         </w:rPr>
-        <w:t xml:space="preserve">17 course omakase journey led by Executive Chef Kei Yoshino. Intimate 8-seat counter in the back of the old Scarr's Pizza space. $85 at dining tables, $100 at the sushi counter. Also offers okonomi (a la carte) and a sake bar. Traditional with deep reverence for edomae technique.</w:t>
+        <w:t xml:space="preserve">17 course omakase journey led by Executive Chef Kei Yoshino. Intimate 8-seat counter in the back of the old Scarr's Pizza space. $85 at dining tables, $100 at the sushi counter. Also offers okonomi (a la carte) and a sake bar. Traditional edomae technique.</w:t>
       </w:r>
     </w:p>
     <w:sectPr>

</xml_diff>